<commit_message>
Sync August reports and template styling
</commit_message>
<xml_diff>
--- a/output/candler_hospital_savannah_ga_us_controllers_84253f5fb67b_84253fab8c75_august_2026_report.docx
+++ b/output/candler_hospital_savannah_ga_us_controllers_84253f5fb67b_84253fab8c75_august_2026_report.docx
@@ -11,7 +11,7 @@
         <w:rPr>
           <w:b/>
           <w:i w:val="0"/>
-          <w:color w:val="444444"/>
+          <w:color w:val="686868"/>
           <w:sz w:val="20"/>
         </w:rPr>
         <w:t>BUCKMAN DIGITAL WATER</w:t>
@@ -40,7 +40,7 @@
         <w:rPr>
           <w:b/>
           <w:i w:val="0"/>
-          <w:color w:val="00857C"/>
+          <w:color w:val="009878"/>
           <w:sz w:val="30"/>
         </w:rPr>
         <w:t>Candler Hospital Savannah GA (US)</w:t>
@@ -55,7 +55,7 @@
         <w:rPr>
           <w:b w:val="0"/>
           <w:i w:val="0"/>
-          <w:color w:val="444444"/>
+          <w:color w:val="686868"/>
           <w:sz w:val="20"/>
         </w:rPr>
         <w:t>Reporting Month: August 2026</w:t>
@@ -77,7 +77,20 @@
         <w:tc>
           <w:tcPr>
             <w:tcW w:type="dxa" w:w="3118"/>
-            <w:shd w:val="clear" w:color="auto" w:fill="00857C"/>
+            <w:vAlign w:val="center"/>
+            <w:shd w:val="clear" w:color="auto" w:fill="009878"/>
+            <w:tcBorders>
+              <w:top w:val="single" w:sz="4" w:space="0" w:color="D0D0D0"/>
+              <w:left w:val="single" w:sz="4" w:space="0" w:color="D0D0D0"/>
+              <w:bottom w:val="single" w:sz="4" w:space="0" w:color="D0D0D0"/>
+              <w:right w:val="single" w:sz="4" w:space="0" w:color="D0D0D0"/>
+            </w:tcBorders>
+            <w:tcMar>
+              <w:top w:w="90" w:type="dxa"/>
+              <w:start w:w="120" w:type="dxa"/>
+              <w:bottom w:w="90" w:type="dxa"/>
+              <w:end w:w="120" w:type="dxa"/>
+            </w:tcMar>
           </w:tcPr>
           <w:p>
             <w:pPr>
@@ -96,7 +109,20 @@
         <w:tc>
           <w:tcPr>
             <w:tcW w:type="dxa" w:w="1701"/>
-            <w:shd w:val="clear" w:color="auto" w:fill="00857C"/>
+            <w:vAlign w:val="center"/>
+            <w:shd w:val="clear" w:color="auto" w:fill="009878"/>
+            <w:tcBorders>
+              <w:top w:val="single" w:sz="4" w:space="0" w:color="D0D0D0"/>
+              <w:left w:val="single" w:sz="4" w:space="0" w:color="D0D0D0"/>
+              <w:bottom w:val="single" w:sz="4" w:space="0" w:color="D0D0D0"/>
+              <w:right w:val="single" w:sz="4" w:space="0" w:color="D0D0D0"/>
+            </w:tcBorders>
+            <w:tcMar>
+              <w:top w:w="90" w:type="dxa"/>
+              <w:start w:w="120" w:type="dxa"/>
+              <w:bottom w:w="90" w:type="dxa"/>
+              <w:end w:w="120" w:type="dxa"/>
+            </w:tcMar>
           </w:tcPr>
           <w:p>
             <w:pPr>
@@ -115,7 +141,20 @@
         <w:tc>
           <w:tcPr>
             <w:tcW w:type="dxa" w:w="1984"/>
-            <w:shd w:val="clear" w:color="auto" w:fill="00857C"/>
+            <w:vAlign w:val="center"/>
+            <w:shd w:val="clear" w:color="auto" w:fill="009878"/>
+            <w:tcBorders>
+              <w:top w:val="single" w:sz="4" w:space="0" w:color="D0D0D0"/>
+              <w:left w:val="single" w:sz="4" w:space="0" w:color="D0D0D0"/>
+              <w:bottom w:val="single" w:sz="4" w:space="0" w:color="D0D0D0"/>
+              <w:right w:val="single" w:sz="4" w:space="0" w:color="D0D0D0"/>
+            </w:tcBorders>
+            <w:tcMar>
+              <w:top w:w="90" w:type="dxa"/>
+              <w:start w:w="120" w:type="dxa"/>
+              <w:bottom w:w="90" w:type="dxa"/>
+              <w:end w:w="120" w:type="dxa"/>
+            </w:tcMar>
           </w:tcPr>
           <w:p>
             <w:pPr>
@@ -134,7 +173,20 @@
         <w:tc>
           <w:tcPr>
             <w:tcW w:type="dxa" w:w="2551"/>
-            <w:shd w:val="clear" w:color="auto" w:fill="00857C"/>
+            <w:vAlign w:val="center"/>
+            <w:shd w:val="clear" w:color="auto" w:fill="009878"/>
+            <w:tcBorders>
+              <w:top w:val="single" w:sz="4" w:space="0" w:color="D0D0D0"/>
+              <w:left w:val="single" w:sz="4" w:space="0" w:color="D0D0D0"/>
+              <w:bottom w:val="single" w:sz="4" w:space="0" w:color="D0D0D0"/>
+              <w:right w:val="single" w:sz="4" w:space="0" w:color="D0D0D0"/>
+            </w:tcBorders>
+            <w:tcMar>
+              <w:top w:w="90" w:type="dxa"/>
+              <w:start w:w="120" w:type="dxa"/>
+              <w:bottom w:w="90" w:type="dxa"/>
+              <w:end w:w="120" w:type="dxa"/>
+            </w:tcMar>
           </w:tcPr>
           <w:p>
             <w:pPr>
@@ -155,7 +207,20 @@
         <w:tc>
           <w:tcPr>
             <w:tcW w:type="dxa" w:w="3118"/>
+            <w:vAlign w:val="center"/>
             <w:shd w:val="clear" w:color="auto" w:fill="FFFFFF"/>
+            <w:tcBorders>
+              <w:top w:val="single" w:sz="4" w:space="0" w:color="D0D0D0"/>
+              <w:left w:val="single" w:sz="4" w:space="0" w:color="D0D0D0"/>
+              <w:bottom w:val="single" w:sz="4" w:space="0" w:color="D0D0D0"/>
+              <w:right w:val="single" w:sz="4" w:space="0" w:color="D0D0D0"/>
+            </w:tcBorders>
+            <w:tcMar>
+              <w:top w:w="90" w:type="dxa"/>
+              <w:start w:w="120" w:type="dxa"/>
+              <w:bottom w:w="90" w:type="dxa"/>
+              <w:end w:w="120" w:type="dxa"/>
+            </w:tcMar>
           </w:tcPr>
           <w:p>
             <w:pPr>
@@ -172,7 +237,20 @@
         <w:tc>
           <w:tcPr>
             <w:tcW w:type="dxa" w:w="1701"/>
+            <w:vAlign w:val="center"/>
             <w:shd w:val="clear" w:color="auto" w:fill="FFFFFF"/>
+            <w:tcBorders>
+              <w:top w:val="single" w:sz="4" w:space="0" w:color="D0D0D0"/>
+              <w:left w:val="single" w:sz="4" w:space="0" w:color="D0D0D0"/>
+              <w:bottom w:val="single" w:sz="4" w:space="0" w:color="D0D0D0"/>
+              <w:right w:val="single" w:sz="4" w:space="0" w:color="D0D0D0"/>
+            </w:tcBorders>
+            <w:tcMar>
+              <w:top w:w="90" w:type="dxa"/>
+              <w:start w:w="120" w:type="dxa"/>
+              <w:bottom w:w="90" w:type="dxa"/>
+              <w:end w:w="120" w:type="dxa"/>
+            </w:tcMar>
           </w:tcPr>
           <w:p>
             <w:pPr>
@@ -189,7 +267,20 @@
         <w:tc>
           <w:tcPr>
             <w:tcW w:type="dxa" w:w="1984"/>
+            <w:vAlign w:val="center"/>
             <w:shd w:val="clear" w:color="auto" w:fill="FFFFFF"/>
+            <w:tcBorders>
+              <w:top w:val="single" w:sz="4" w:space="0" w:color="D0D0D0"/>
+              <w:left w:val="single" w:sz="4" w:space="0" w:color="D0D0D0"/>
+              <w:bottom w:val="single" w:sz="4" w:space="0" w:color="D0D0D0"/>
+              <w:right w:val="single" w:sz="4" w:space="0" w:color="D0D0D0"/>
+            </w:tcBorders>
+            <w:tcMar>
+              <w:top w:w="90" w:type="dxa"/>
+              <w:start w:w="120" w:type="dxa"/>
+              <w:bottom w:w="90" w:type="dxa"/>
+              <w:end w:w="120" w:type="dxa"/>
+            </w:tcMar>
           </w:tcPr>
           <w:p>
             <w:pPr>
@@ -206,7 +297,20 @@
         <w:tc>
           <w:tcPr>
             <w:tcW w:type="dxa" w:w="2551"/>
+            <w:vAlign w:val="center"/>
             <w:shd w:val="clear" w:color="auto" w:fill="FFFFFF"/>
+            <w:tcBorders>
+              <w:top w:val="single" w:sz="4" w:space="0" w:color="D0D0D0"/>
+              <w:left w:val="single" w:sz="4" w:space="0" w:color="D0D0D0"/>
+              <w:bottom w:val="single" w:sz="4" w:space="0" w:color="D0D0D0"/>
+              <w:right w:val="single" w:sz="4" w:space="0" w:color="D0D0D0"/>
+            </w:tcBorders>
+            <w:tcMar>
+              <w:top w:w="90" w:type="dxa"/>
+              <w:start w:w="120" w:type="dxa"/>
+              <w:bottom w:w="90" w:type="dxa"/>
+              <w:end w:w="120" w:type="dxa"/>
+            </w:tcMar>
           </w:tcPr>
           <w:p>
             <w:pPr>
@@ -238,7 +342,7 @@
         <w:rPr>
           <w:b w:val="0"/>
           <w:i w:val="0"/>
-          <w:color w:val="444444"/>
+          <w:color w:val="686868"/>
           <w:sz w:val="19"/>
         </w:rPr>
         <w:t>This report summarises corrosion control, scale control, microbial control, water efficiency, product efficiency, and proactive system support for Candler Hospital Savannah GA (US), August 2026, using controller setpoints, telemetry KPIs, field data, and service note records.</w:t>
@@ -265,7 +369,20 @@
         <w:tc>
           <w:tcPr>
             <w:tcW w:type="dxa" w:w="3118"/>
-            <w:shd w:val="clear" w:color="auto" w:fill="00857C"/>
+            <w:vAlign w:val="center"/>
+            <w:shd w:val="clear" w:color="auto" w:fill="009878"/>
+            <w:tcBorders>
+              <w:top w:val="single" w:sz="4" w:space="0" w:color="D0D0D0"/>
+              <w:left w:val="single" w:sz="4" w:space="0" w:color="D0D0D0"/>
+              <w:bottom w:val="single" w:sz="4" w:space="0" w:color="D0D0D0"/>
+              <w:right w:val="single" w:sz="4" w:space="0" w:color="D0D0D0"/>
+            </w:tcBorders>
+            <w:tcMar>
+              <w:top w:w="90" w:type="dxa"/>
+              <w:start w:w="120" w:type="dxa"/>
+              <w:bottom w:w="90" w:type="dxa"/>
+              <w:end w:w="120" w:type="dxa"/>
+            </w:tcMar>
           </w:tcPr>
           <w:p>
             <w:pPr>
@@ -284,7 +401,20 @@
         <w:tc>
           <w:tcPr>
             <w:tcW w:type="dxa" w:w="2835"/>
-            <w:shd w:val="clear" w:color="auto" w:fill="00857C"/>
+            <w:vAlign w:val="center"/>
+            <w:shd w:val="clear" w:color="auto" w:fill="009878"/>
+            <w:tcBorders>
+              <w:top w:val="single" w:sz="4" w:space="0" w:color="D0D0D0"/>
+              <w:left w:val="single" w:sz="4" w:space="0" w:color="D0D0D0"/>
+              <w:bottom w:val="single" w:sz="4" w:space="0" w:color="D0D0D0"/>
+              <w:right w:val="single" w:sz="4" w:space="0" w:color="D0D0D0"/>
+            </w:tcBorders>
+            <w:tcMar>
+              <w:top w:w="90" w:type="dxa"/>
+              <w:start w:w="120" w:type="dxa"/>
+              <w:bottom w:w="90" w:type="dxa"/>
+              <w:end w:w="120" w:type="dxa"/>
+            </w:tcMar>
           </w:tcPr>
           <w:p>
             <w:pPr>
@@ -303,7 +433,20 @@
         <w:tc>
           <w:tcPr>
             <w:tcW w:type="dxa" w:w="3402"/>
-            <w:shd w:val="clear" w:color="auto" w:fill="00857C"/>
+            <w:vAlign w:val="center"/>
+            <w:shd w:val="clear" w:color="auto" w:fill="009878"/>
+            <w:tcBorders>
+              <w:top w:val="single" w:sz="4" w:space="0" w:color="D0D0D0"/>
+              <w:left w:val="single" w:sz="4" w:space="0" w:color="D0D0D0"/>
+              <w:bottom w:val="single" w:sz="4" w:space="0" w:color="D0D0D0"/>
+              <w:right w:val="single" w:sz="4" w:space="0" w:color="D0D0D0"/>
+            </w:tcBorders>
+            <w:tcMar>
+              <w:top w:w="90" w:type="dxa"/>
+              <w:start w:w="120" w:type="dxa"/>
+              <w:bottom w:w="90" w:type="dxa"/>
+              <w:end w:w="120" w:type="dxa"/>
+            </w:tcMar>
           </w:tcPr>
           <w:p>
             <w:pPr>
@@ -324,7 +467,20 @@
         <w:tc>
           <w:tcPr>
             <w:tcW w:type="dxa" w:w="3118"/>
+            <w:vAlign w:val="center"/>
             <w:shd w:val="clear" w:color="auto" w:fill="FFFFFF"/>
+            <w:tcBorders>
+              <w:top w:val="single" w:sz="4" w:space="0" w:color="D0D0D0"/>
+              <w:left w:val="single" w:sz="4" w:space="0" w:color="D0D0D0"/>
+              <w:bottom w:val="single" w:sz="4" w:space="0" w:color="D0D0D0"/>
+              <w:right w:val="single" w:sz="4" w:space="0" w:color="D0D0D0"/>
+            </w:tcBorders>
+            <w:tcMar>
+              <w:top w:w="90" w:type="dxa"/>
+              <w:start w:w="120" w:type="dxa"/>
+              <w:bottom w:w="90" w:type="dxa"/>
+              <w:end w:w="120" w:type="dxa"/>
+            </w:tcMar>
           </w:tcPr>
           <w:p>
             <w:pPr>
@@ -341,7 +497,20 @@
         <w:tc>
           <w:tcPr>
             <w:tcW w:type="dxa" w:w="2835"/>
+            <w:vAlign w:val="center"/>
             <w:shd w:val="clear" w:color="auto" w:fill="FFFFFF"/>
+            <w:tcBorders>
+              <w:top w:val="single" w:sz="4" w:space="0" w:color="D0D0D0"/>
+              <w:left w:val="single" w:sz="4" w:space="0" w:color="D0D0D0"/>
+              <w:bottom w:val="single" w:sz="4" w:space="0" w:color="D0D0D0"/>
+              <w:right w:val="single" w:sz="4" w:space="0" w:color="D0D0D0"/>
+            </w:tcBorders>
+            <w:tcMar>
+              <w:top w:w="90" w:type="dxa"/>
+              <w:start w:w="120" w:type="dxa"/>
+              <w:bottom w:w="90" w:type="dxa"/>
+              <w:end w:w="120" w:type="dxa"/>
+            </w:tcMar>
           </w:tcPr>
           <w:p>
             <w:pPr>
@@ -351,14 +520,27 @@
               <w:rPr>
                 <w:sz w:val="18"/>
               </w:rPr>
-              <w:t>09 September 2026</w:t>
+              <w:t>23 September 2026</w:t>
             </w:r>
           </w:p>
         </w:tc>
         <w:tc>
           <w:tcPr>
             <w:tcW w:type="dxa" w:w="3402"/>
+            <w:vAlign w:val="center"/>
             <w:shd w:val="clear" w:color="auto" w:fill="FFFFFF"/>
+            <w:tcBorders>
+              <w:top w:val="single" w:sz="4" w:space="0" w:color="D0D0D0"/>
+              <w:left w:val="single" w:sz="4" w:space="0" w:color="D0D0D0"/>
+              <w:bottom w:val="single" w:sz="4" w:space="0" w:color="D0D0D0"/>
+              <w:right w:val="single" w:sz="4" w:space="0" w:color="D0D0D0"/>
+            </w:tcBorders>
+            <w:tcMar>
+              <w:top w:w="90" w:type="dxa"/>
+              <w:start w:w="120" w:type="dxa"/>
+              <w:bottom w:w="90" w:type="dxa"/>
+              <w:end w:w="120" w:type="dxa"/>
+            </w:tcMar>
           </w:tcPr>
           <w:p>
             <w:pPr>
@@ -382,28 +564,26 @@
     </w:p>
     <w:p>
       <w:pPr>
-        <w:pBdr>
-          <w:bottom w:val="single" w:sz="8" w:space="4" w:color="00857C"/>
-        </w:pBdr>
-        <w:spacing w:before="280" w:after="80"/>
+        <w:spacing w:before="280" w:after="140"/>
+        <w:shd w:val="clear" w:color="auto" w:fill="009878"/>
       </w:pPr>
       <w:r>
         <w:rPr>
           <w:b/>
-          <w:color w:val="00857C"/>
-          <w:sz w:val="32"/>
+          <w:color w:val="FFFFFF"/>
+          <w:sz w:val="24"/>
         </w:rPr>
-        <w:t>Executive Summary</w:t>
+        <w:t xml:space="preserve">  Executive Summary</w:t>
       </w:r>
     </w:p>
     <w:p>
       <w:pPr>
-        <w:spacing w:before="200" w:after="60"/>
+        <w:spacing w:before="200" w:after="80"/>
       </w:pPr>
       <w:r>
         <w:rPr>
           <w:b/>
-          <w:color w:val="005F58"/>
+          <w:color w:val="1D5C7F"/>
           <w:sz w:val="26"/>
         </w:rPr>
         <w:t>System Health Check</w:t>
@@ -416,7 +596,7 @@
       <w:r>
         <w:rPr>
           <w:b/>
-          <w:color w:val="222222"/>
+          <w:color w:val="212529"/>
           <w:sz w:val="22"/>
         </w:rPr>
         <w:t>Corrosion Control</w:t>
@@ -425,18 +605,20 @@
     <w:p>
       <w:pPr>
         <w:spacing w:before="60" w:after="100"/>
+        <w:shd w:val="clear" w:color="auto" w:fill="F7F7F7"/>
       </w:pPr>
       <w:r>
         <w:rPr>
           <w:b/>
+          <w:color w:val="1D5C7F"/>
           <w:sz w:val="20"/>
         </w:rPr>
-        <w:t xml:space="preserve">Status: </w:t>
+        <w:t xml:space="preserve"> Status: </w:t>
       </w:r>
       <w:r>
         <w:rPr>
           <w:b/>
-          <w:color w:val="00857C"/>
+          <w:color w:val="009878"/>
           <w:sz w:val="20"/>
         </w:rPr>
         <w:t>Excellent</w:t>
@@ -463,7 +645,7 @@
       <w:r>
         <w:rPr>
           <w:b/>
-          <w:color w:val="222222"/>
+          <w:color w:val="212529"/>
           <w:sz w:val="22"/>
         </w:rPr>
         <w:t>Scale Control</w:t>
@@ -472,13 +654,15 @@
     <w:p>
       <w:pPr>
         <w:spacing w:before="60" w:after="100"/>
+        <w:shd w:val="clear" w:color="auto" w:fill="F7F7F7"/>
       </w:pPr>
       <w:r>
         <w:rPr>
           <w:b/>
+          <w:color w:val="1D5C7F"/>
           <w:sz w:val="20"/>
         </w:rPr>
-        <w:t xml:space="preserve">Status: </w:t>
+        <w:t xml:space="preserve"> Status: </w:t>
       </w:r>
       <w:r>
         <w:rPr>
@@ -510,7 +694,7 @@
       <w:r>
         <w:rPr>
           <w:b/>
-          <w:color w:val="222222"/>
+          <w:color w:val="212529"/>
           <w:sz w:val="22"/>
         </w:rPr>
         <w:t>Microbial Control</w:t>
@@ -519,13 +703,15 @@
     <w:p>
       <w:pPr>
         <w:spacing w:before="60" w:after="100"/>
+        <w:shd w:val="clear" w:color="auto" w:fill="F7F7F7"/>
       </w:pPr>
       <w:r>
         <w:rPr>
           <w:b/>
+          <w:color w:val="1D5C7F"/>
           <w:sz w:val="20"/>
         </w:rPr>
-        <w:t xml:space="preserve">Status: </w:t>
+        <w:t xml:space="preserve"> Status: </w:t>
       </w:r>
       <w:r>
         <w:rPr>
@@ -552,12 +738,12 @@
     </w:p>
     <w:p>
       <w:pPr>
-        <w:spacing w:before="200" w:after="60"/>
+        <w:spacing w:before="200" w:after="80"/>
       </w:pPr>
       <w:r>
         <w:rPr>
           <w:b/>
-          <w:color w:val="005F58"/>
+          <w:color w:val="1D5C7F"/>
           <w:sz w:val="26"/>
         </w:rPr>
         <w:t>Water Efficiency</w:t>
@@ -566,18 +752,20 @@
     <w:p>
       <w:pPr>
         <w:spacing w:before="60" w:after="100"/>
+        <w:shd w:val="clear" w:color="auto" w:fill="F7F7F7"/>
       </w:pPr>
       <w:r>
         <w:rPr>
           <w:b/>
+          <w:color w:val="1D5C7F"/>
           <w:sz w:val="20"/>
         </w:rPr>
-        <w:t xml:space="preserve">Status: </w:t>
+        <w:t xml:space="preserve"> Status: </w:t>
       </w:r>
       <w:r>
         <w:rPr>
           <w:b/>
-          <w:color w:val="00857C"/>
+          <w:color w:val="009878"/>
           <w:sz w:val="20"/>
         </w:rPr>
         <w:t>Excellent</w:t>
@@ -600,7 +788,20 @@
         <w:tc>
           <w:tcPr>
             <w:tcW w:type="dxa" w:w="1928"/>
-            <w:shd w:val="clear" w:color="auto" w:fill="00857C"/>
+            <w:vAlign w:val="center"/>
+            <w:shd w:val="clear" w:color="auto" w:fill="009878"/>
+            <w:tcBorders>
+              <w:top w:val="single" w:sz="4" w:space="0" w:color="D0D0D0"/>
+              <w:left w:val="single" w:sz="4" w:space="0" w:color="D0D0D0"/>
+              <w:bottom w:val="single" w:sz="4" w:space="0" w:color="D0D0D0"/>
+              <w:right w:val="single" w:sz="4" w:space="0" w:color="D0D0D0"/>
+            </w:tcBorders>
+            <w:tcMar>
+              <w:top w:w="90" w:type="dxa"/>
+              <w:start w:w="120" w:type="dxa"/>
+              <w:bottom w:w="90" w:type="dxa"/>
+              <w:end w:w="120" w:type="dxa"/>
+            </w:tcMar>
           </w:tcPr>
           <w:p>
             <w:pPr>
@@ -619,7 +820,20 @@
         <w:tc>
           <w:tcPr>
             <w:tcW w:type="dxa" w:w="1928"/>
-            <w:shd w:val="clear" w:color="auto" w:fill="00857C"/>
+            <w:vAlign w:val="center"/>
+            <w:shd w:val="clear" w:color="auto" w:fill="009878"/>
+            <w:tcBorders>
+              <w:top w:val="single" w:sz="4" w:space="0" w:color="D0D0D0"/>
+              <w:left w:val="single" w:sz="4" w:space="0" w:color="D0D0D0"/>
+              <w:bottom w:val="single" w:sz="4" w:space="0" w:color="D0D0D0"/>
+              <w:right w:val="single" w:sz="4" w:space="0" w:color="D0D0D0"/>
+            </w:tcBorders>
+            <w:tcMar>
+              <w:top w:w="90" w:type="dxa"/>
+              <w:start w:w="120" w:type="dxa"/>
+              <w:bottom w:w="90" w:type="dxa"/>
+              <w:end w:w="120" w:type="dxa"/>
+            </w:tcMar>
           </w:tcPr>
           <w:p>
             <w:pPr>
@@ -638,7 +852,20 @@
         <w:tc>
           <w:tcPr>
             <w:tcW w:type="dxa" w:w="1928"/>
-            <w:shd w:val="clear" w:color="auto" w:fill="00857C"/>
+            <w:vAlign w:val="center"/>
+            <w:shd w:val="clear" w:color="auto" w:fill="009878"/>
+            <w:tcBorders>
+              <w:top w:val="single" w:sz="4" w:space="0" w:color="D0D0D0"/>
+              <w:left w:val="single" w:sz="4" w:space="0" w:color="D0D0D0"/>
+              <w:bottom w:val="single" w:sz="4" w:space="0" w:color="D0D0D0"/>
+              <w:right w:val="single" w:sz="4" w:space="0" w:color="D0D0D0"/>
+            </w:tcBorders>
+            <w:tcMar>
+              <w:top w:w="90" w:type="dxa"/>
+              <w:start w:w="120" w:type="dxa"/>
+              <w:bottom w:w="90" w:type="dxa"/>
+              <w:end w:w="120" w:type="dxa"/>
+            </w:tcMar>
           </w:tcPr>
           <w:p>
             <w:pPr>
@@ -657,7 +884,20 @@
         <w:tc>
           <w:tcPr>
             <w:tcW w:type="dxa" w:w="1928"/>
-            <w:shd w:val="clear" w:color="auto" w:fill="00857C"/>
+            <w:vAlign w:val="center"/>
+            <w:shd w:val="clear" w:color="auto" w:fill="009878"/>
+            <w:tcBorders>
+              <w:top w:val="single" w:sz="4" w:space="0" w:color="D0D0D0"/>
+              <w:left w:val="single" w:sz="4" w:space="0" w:color="D0D0D0"/>
+              <w:bottom w:val="single" w:sz="4" w:space="0" w:color="D0D0D0"/>
+              <w:right w:val="single" w:sz="4" w:space="0" w:color="D0D0D0"/>
+            </w:tcBorders>
+            <w:tcMar>
+              <w:top w:w="90" w:type="dxa"/>
+              <w:start w:w="120" w:type="dxa"/>
+              <w:bottom w:w="90" w:type="dxa"/>
+              <w:end w:w="120" w:type="dxa"/>
+            </w:tcMar>
           </w:tcPr>
           <w:p>
             <w:pPr>
@@ -676,7 +916,20 @@
         <w:tc>
           <w:tcPr>
             <w:tcW w:type="dxa" w:w="1928"/>
-            <w:shd w:val="clear" w:color="auto" w:fill="00857C"/>
+            <w:vAlign w:val="center"/>
+            <w:shd w:val="clear" w:color="auto" w:fill="009878"/>
+            <w:tcBorders>
+              <w:top w:val="single" w:sz="4" w:space="0" w:color="D0D0D0"/>
+              <w:left w:val="single" w:sz="4" w:space="0" w:color="D0D0D0"/>
+              <w:bottom w:val="single" w:sz="4" w:space="0" w:color="D0D0D0"/>
+              <w:right w:val="single" w:sz="4" w:space="0" w:color="D0D0D0"/>
+            </w:tcBorders>
+            <w:tcMar>
+              <w:top w:w="90" w:type="dxa"/>
+              <w:start w:w="120" w:type="dxa"/>
+              <w:bottom w:w="90" w:type="dxa"/>
+              <w:end w:w="120" w:type="dxa"/>
+            </w:tcMar>
           </w:tcPr>
           <w:p>
             <w:pPr>
@@ -697,7 +950,20 @@
         <w:tc>
           <w:tcPr>
             <w:tcW w:type="dxa" w:w="1928"/>
+            <w:vAlign w:val="center"/>
             <w:shd w:val="clear" w:color="auto" w:fill="FFFFFF"/>
+            <w:tcBorders>
+              <w:top w:val="single" w:sz="4" w:space="0" w:color="D0D0D0"/>
+              <w:left w:val="single" w:sz="4" w:space="0" w:color="D0D0D0"/>
+              <w:bottom w:val="single" w:sz="4" w:space="0" w:color="D0D0D0"/>
+              <w:right w:val="single" w:sz="4" w:space="0" w:color="D0D0D0"/>
+            </w:tcBorders>
+            <w:tcMar>
+              <w:top w:w="90" w:type="dxa"/>
+              <w:start w:w="120" w:type="dxa"/>
+              <w:bottom w:w="90" w:type="dxa"/>
+              <w:end w:w="120" w:type="dxa"/>
+            </w:tcMar>
           </w:tcPr>
           <w:p>
             <w:pPr>
@@ -714,7 +980,20 @@
         <w:tc>
           <w:tcPr>
             <w:tcW w:type="dxa" w:w="1928"/>
+            <w:vAlign w:val="center"/>
             <w:shd w:val="clear" w:color="auto" w:fill="FFFFFF"/>
+            <w:tcBorders>
+              <w:top w:val="single" w:sz="4" w:space="0" w:color="D0D0D0"/>
+              <w:left w:val="single" w:sz="4" w:space="0" w:color="D0D0D0"/>
+              <w:bottom w:val="single" w:sz="4" w:space="0" w:color="D0D0D0"/>
+              <w:right w:val="single" w:sz="4" w:space="0" w:color="D0D0D0"/>
+            </w:tcBorders>
+            <w:tcMar>
+              <w:top w:w="90" w:type="dxa"/>
+              <w:start w:w="120" w:type="dxa"/>
+              <w:bottom w:w="90" w:type="dxa"/>
+              <w:end w:w="120" w:type="dxa"/>
+            </w:tcMar>
           </w:tcPr>
           <w:p>
             <w:pPr>
@@ -731,7 +1010,20 @@
         <w:tc>
           <w:tcPr>
             <w:tcW w:type="dxa" w:w="1928"/>
+            <w:vAlign w:val="center"/>
             <w:shd w:val="clear" w:color="auto" w:fill="FFFFFF"/>
+            <w:tcBorders>
+              <w:top w:val="single" w:sz="4" w:space="0" w:color="D0D0D0"/>
+              <w:left w:val="single" w:sz="4" w:space="0" w:color="D0D0D0"/>
+              <w:bottom w:val="single" w:sz="4" w:space="0" w:color="D0D0D0"/>
+              <w:right w:val="single" w:sz="4" w:space="0" w:color="D0D0D0"/>
+            </w:tcBorders>
+            <w:tcMar>
+              <w:top w:w="90" w:type="dxa"/>
+              <w:start w:w="120" w:type="dxa"/>
+              <w:bottom w:w="90" w:type="dxa"/>
+              <w:end w:w="120" w:type="dxa"/>
+            </w:tcMar>
           </w:tcPr>
           <w:p>
             <w:pPr>
@@ -748,7 +1040,20 @@
         <w:tc>
           <w:tcPr>
             <w:tcW w:type="dxa" w:w="1928"/>
+            <w:vAlign w:val="center"/>
             <w:shd w:val="clear" w:color="auto" w:fill="FFFFFF"/>
+            <w:tcBorders>
+              <w:top w:val="single" w:sz="4" w:space="0" w:color="D0D0D0"/>
+              <w:left w:val="single" w:sz="4" w:space="0" w:color="D0D0D0"/>
+              <w:bottom w:val="single" w:sz="4" w:space="0" w:color="D0D0D0"/>
+              <w:right w:val="single" w:sz="4" w:space="0" w:color="D0D0D0"/>
+            </w:tcBorders>
+            <w:tcMar>
+              <w:top w:w="90" w:type="dxa"/>
+              <w:start w:w="120" w:type="dxa"/>
+              <w:bottom w:w="90" w:type="dxa"/>
+              <w:end w:w="120" w:type="dxa"/>
+            </w:tcMar>
           </w:tcPr>
           <w:p>
             <w:pPr>
@@ -765,7 +1070,20 @@
         <w:tc>
           <w:tcPr>
             <w:tcW w:type="dxa" w:w="1928"/>
+            <w:vAlign w:val="center"/>
             <w:shd w:val="clear" w:color="auto" w:fill="FFFFFF"/>
+            <w:tcBorders>
+              <w:top w:val="single" w:sz="4" w:space="0" w:color="D0D0D0"/>
+              <w:left w:val="single" w:sz="4" w:space="0" w:color="D0D0D0"/>
+              <w:bottom w:val="single" w:sz="4" w:space="0" w:color="D0D0D0"/>
+              <w:right w:val="single" w:sz="4" w:space="0" w:color="D0D0D0"/>
+            </w:tcBorders>
+            <w:tcMar>
+              <w:top w:w="90" w:type="dxa"/>
+              <w:start w:w="120" w:type="dxa"/>
+              <w:bottom w:w="90" w:type="dxa"/>
+              <w:end w:w="120" w:type="dxa"/>
+            </w:tcMar>
           </w:tcPr>
           <w:p>
             <w:pPr>
@@ -793,17 +1111,17 @@
           <w:i w:val="0"/>
           <w:sz w:val="20"/>
         </w:rPr>
-        <w:t>Water efficiency was Critical. Conductivity averaged 668.76 uS/cm against the 570.00-630.00 uS/cm Controller Setpoint range, with only 5.4% of readings in range. Conductivity increased from about 633.9 uS/cm early in the month to 703.6 uS/cm later in the month, indicating high cycles, reduced blowdown, evaporation concentration, or concentrated makeup conditions need review.</w:t>
+        <w:t>The average conductivity is 668.8 µS/cm, which is above the recommended setpoint range of 570-630 µS/cm. Conductivity increased from about 633.9 µS/cm at the start of the month to 703.6 µS/cm at the end. Recommendation: reduced blowdown, higher cycles, evaporation concentration, or concentrated makeup is raising conductivity.</w:t>
       </w:r>
     </w:p>
     <w:p>
       <w:pPr>
-        <w:spacing w:before="200" w:after="60"/>
+        <w:spacing w:before="200" w:after="80"/>
       </w:pPr>
       <w:r>
         <w:rPr>
           <w:b/>
-          <w:color w:val="005F58"/>
+          <w:color w:val="1D5C7F"/>
           <w:sz w:val="26"/>
         </w:rPr>
         <w:t>Product Efficiency</w:t>
@@ -812,13 +1130,15 @@
     <w:p>
       <w:pPr>
         <w:spacing w:before="60" w:after="100"/>
+        <w:shd w:val="clear" w:color="auto" w:fill="F7F7F7"/>
       </w:pPr>
       <w:r>
         <w:rPr>
           <w:b/>
+          <w:color w:val="1D5C7F"/>
           <w:sz w:val="20"/>
         </w:rPr>
-        <w:t xml:space="preserve">Status: </w:t>
+        <w:t xml:space="preserve"> Status: </w:t>
       </w:r>
       <w:r>
         <w:rPr>
@@ -845,12 +1165,26 @@
     </w:p>
     <w:p>
       <w:pPr>
-        <w:spacing w:before="200" w:after="60"/>
+        <w:spacing w:before="80" w:after="120"/>
+        <w:jc w:val="left"/>
+      </w:pPr>
+      <w:r>
+        <w:rPr>
+          <w:b w:val="0"/>
+          <w:i w:val="0"/>
+          <w:sz w:val="20"/>
+        </w:rPr>
+        <w:t>The target consumption rate is 83.8 pounds/month whereas current consumption rate is 148.6 pounds. There is increase in consumption by 64.8 pounds, indicating overdosage.</w:t>
+      </w:r>
+    </w:p>
+    <w:p>
+      <w:pPr>
+        <w:spacing w:before="200" w:after="80"/>
       </w:pPr>
       <w:r>
         <w:rPr>
           <w:b/>
-          <w:color w:val="005F58"/>
+          <w:color w:val="1D5C7F"/>
           <w:sz w:val="26"/>
         </w:rPr>
         <w:t>Proactive System Support</w:t>
@@ -867,7 +1201,7 @@
           <w:i w:val="0"/>
           <w:sz w:val="20"/>
         </w:rPr>
-        <w:t>No service notes were recorded for the August reporting period. Recommended follow-up: Confirm inhibitor residual, inspect for deposit activity, and compare corrosion movement with ORP and product trends. Traced Product deviation remained at about 87.1% in the last 7 days, so correct the conductivity trend by checking cycles, blowdown, makeup, and dilution behavior before changing feed settings. Check FRC during the upcoming service visit to confirm oxidizing biocide residual. Measure dip-slide CFU during the upcoming service visit to confirm microbial control. Verify phosphate and silica residuals during the next service visit.</w:t>
+        <w:t>Recommended follow-up: Confirm inhibitor residual, inspect for deposit activity, and compare corrosion movement with ORP and product trends. Traced Product deviation remained at about 87.1% in the last 7 days, so correct the conductivity trend by checking cycles, blowdown, makeup, and dilution behavior before changing feed settings. Check FRC during the upcoming service visit to confirm oxidizing biocide residual. Measure dip-slide CFU during the upcoming service visit to confirm microbial control. Verify phosphate and silica residuals during the next service visit.</w:t>
       </w:r>
     </w:p>
     <w:p>
@@ -877,18 +1211,16 @@
     </w:p>
     <w:p>
       <w:pPr>
-        <w:pBdr>
-          <w:bottom w:val="single" w:sz="8" w:space="4" w:color="00857C"/>
-        </w:pBdr>
-        <w:spacing w:before="280" w:after="80"/>
+        <w:spacing w:before="280" w:after="140"/>
+        <w:shd w:val="clear" w:color="auto" w:fill="009878"/>
       </w:pPr>
       <w:r>
         <w:rPr>
           <w:b/>
-          <w:color w:val="00857C"/>
-          <w:sz w:val="32"/>
+          <w:color w:val="FFFFFF"/>
+          <w:sz w:val="24"/>
         </w:rPr>
-        <w:t>Performance Summary</w:t>
+        <w:t xml:space="preserve">  Performance Summary</w:t>
       </w:r>
     </w:p>
     <w:p>
@@ -900,7 +1232,7 @@
         <w:rPr>
           <w:b w:val="0"/>
           <w:i/>
-          <w:color w:val="444444"/>
+          <w:color w:val="686868"/>
           <w:sz w:val="18"/>
         </w:rPr>
         <w:t>Controller Setpoints are used as control limits below. % In Range is calculated from the full reporting month telemetry.</w:t>
@@ -913,22 +1245,32 @@
         <w:tblLook w:firstColumn="1" w:firstRow="1" w:lastColumn="0" w:lastRow="0" w:noHBand="0" w:noVBand="1" w:val="04A0"/>
       </w:tblPr>
       <w:tblGrid>
-        <w:gridCol w:w="1009"/>
-        <w:gridCol w:w="1009"/>
-        <w:gridCol w:w="1009"/>
-        <w:gridCol w:w="1009"/>
-        <w:gridCol w:w="1009"/>
-        <w:gridCol w:w="1009"/>
-        <w:gridCol w:w="1009"/>
-        <w:gridCol w:w="1009"/>
-        <w:gridCol w:w="1009"/>
-        <w:gridCol w:w="1009"/>
+        <w:gridCol w:w="1441"/>
+        <w:gridCol w:w="1441"/>
+        <w:gridCol w:w="1441"/>
+        <w:gridCol w:w="1441"/>
+        <w:gridCol w:w="1441"/>
+        <w:gridCol w:w="1441"/>
+        <w:gridCol w:w="1441"/>
       </w:tblGrid>
       <w:tr>
         <w:tc>
           <w:tcPr>
-            <w:tcW w:type="dxa" w:w="1814"/>
-            <w:shd w:val="clear" w:color="auto" w:fill="00857C"/>
+            <w:tcW w:type="dxa" w:w="2041"/>
+            <w:vAlign w:val="center"/>
+            <w:shd w:val="clear" w:color="auto" w:fill="009878"/>
+            <w:tcBorders>
+              <w:top w:val="single" w:sz="4" w:space="0" w:color="D0D0D0"/>
+              <w:left w:val="single" w:sz="4" w:space="0" w:color="D0D0D0"/>
+              <w:bottom w:val="single" w:sz="4" w:space="0" w:color="D0D0D0"/>
+              <w:right w:val="single" w:sz="4" w:space="0" w:color="D0D0D0"/>
+            </w:tcBorders>
+            <w:tcMar>
+              <w:top w:w="90" w:type="dxa"/>
+              <w:start w:w="120" w:type="dxa"/>
+              <w:bottom w:w="90" w:type="dxa"/>
+              <w:end w:w="120" w:type="dxa"/>
+            </w:tcMar>
           </w:tcPr>
           <w:p>
             <w:pPr>
@@ -946,8 +1288,21 @@
         </w:tc>
         <w:tc>
           <w:tcPr>
-            <w:tcW w:type="dxa" w:w="1247"/>
-            <w:shd w:val="clear" w:color="auto" w:fill="00857C"/>
+            <w:tcW w:type="dxa" w:w="1417"/>
+            <w:vAlign w:val="center"/>
+            <w:shd w:val="clear" w:color="auto" w:fill="009878"/>
+            <w:tcBorders>
+              <w:top w:val="single" w:sz="4" w:space="0" w:color="D0D0D0"/>
+              <w:left w:val="single" w:sz="4" w:space="0" w:color="D0D0D0"/>
+              <w:bottom w:val="single" w:sz="4" w:space="0" w:color="D0D0D0"/>
+              <w:right w:val="single" w:sz="4" w:space="0" w:color="D0D0D0"/>
+            </w:tcBorders>
+            <w:tcMar>
+              <w:top w:w="90" w:type="dxa"/>
+              <w:start w:w="120" w:type="dxa"/>
+              <w:bottom w:w="90" w:type="dxa"/>
+              <w:end w:w="120" w:type="dxa"/>
+            </w:tcMar>
           </w:tcPr>
           <w:p>
             <w:pPr>
@@ -965,8 +1320,21 @@
         </w:tc>
         <w:tc>
           <w:tcPr>
-            <w:tcW w:type="dxa" w:w="850"/>
-            <w:shd w:val="clear" w:color="auto" w:fill="00857C"/>
+            <w:tcW w:type="dxa" w:w="1020"/>
+            <w:vAlign w:val="center"/>
+            <w:shd w:val="clear" w:color="auto" w:fill="009878"/>
+            <w:tcBorders>
+              <w:top w:val="single" w:sz="4" w:space="0" w:color="D0D0D0"/>
+              <w:left w:val="single" w:sz="4" w:space="0" w:color="D0D0D0"/>
+              <w:bottom w:val="single" w:sz="4" w:space="0" w:color="D0D0D0"/>
+              <w:right w:val="single" w:sz="4" w:space="0" w:color="D0D0D0"/>
+            </w:tcBorders>
+            <w:tcMar>
+              <w:top w:w="90" w:type="dxa"/>
+              <w:start w:w="120" w:type="dxa"/>
+              <w:bottom w:w="90" w:type="dxa"/>
+              <w:end w:w="120" w:type="dxa"/>
+            </w:tcMar>
           </w:tcPr>
           <w:p>
             <w:pPr>
@@ -984,65 +1352,21 @@
         </w:tc>
         <w:tc>
           <w:tcPr>
-            <w:tcW w:type="dxa" w:w="850"/>
-            <w:shd w:val="clear" w:color="auto" w:fill="00857C"/>
-          </w:tcPr>
-          <w:p>
-            <w:pPr>
-              <w:spacing w:before="60" w:after="60"/>
-            </w:pPr>
-            <w:r>
-              <w:rPr>
-                <w:b/>
-                <w:color w:val="FFFFFF"/>
-                <w:sz w:val="18"/>
-              </w:rPr>
-              <w:t>Std Dev</w:t>
-            </w:r>
-          </w:p>
-        </w:tc>
-        <w:tc>
-          <w:tcPr>
-            <w:tcW w:type="dxa" w:w="794"/>
-            <w:shd w:val="clear" w:color="auto" w:fill="00857C"/>
-          </w:tcPr>
-          <w:p>
-            <w:pPr>
-              <w:spacing w:before="60" w:after="60"/>
-            </w:pPr>
-            <w:r>
-              <w:rPr>
-                <w:b/>
-                <w:color w:val="FFFFFF"/>
-                <w:sz w:val="18"/>
-              </w:rPr>
-              <w:t>Min</w:t>
-            </w:r>
-          </w:p>
-        </w:tc>
-        <w:tc>
-          <w:tcPr>
-            <w:tcW w:type="dxa" w:w="794"/>
-            <w:shd w:val="clear" w:color="auto" w:fill="00857C"/>
-          </w:tcPr>
-          <w:p>
-            <w:pPr>
-              <w:spacing w:before="60" w:after="60"/>
-            </w:pPr>
-            <w:r>
-              <w:rPr>
-                <w:b/>
-                <w:color w:val="FFFFFF"/>
-                <w:sz w:val="18"/>
-              </w:rPr>
-              <w:t>Max</w:t>
-            </w:r>
-          </w:p>
-        </w:tc>
-        <w:tc>
-          <w:tcPr>
-            <w:tcW w:type="dxa" w:w="964"/>
-            <w:shd w:val="clear" w:color="auto" w:fill="00857C"/>
+            <w:tcW w:type="dxa" w:w="1077"/>
+            <w:vAlign w:val="center"/>
+            <w:shd w:val="clear" w:color="auto" w:fill="009878"/>
+            <w:tcBorders>
+              <w:top w:val="single" w:sz="4" w:space="0" w:color="D0D0D0"/>
+              <w:left w:val="single" w:sz="4" w:space="0" w:color="D0D0D0"/>
+              <w:bottom w:val="single" w:sz="4" w:space="0" w:color="D0D0D0"/>
+              <w:right w:val="single" w:sz="4" w:space="0" w:color="D0D0D0"/>
+            </w:tcBorders>
+            <w:tcMar>
+              <w:top w:w="90" w:type="dxa"/>
+              <w:start w:w="120" w:type="dxa"/>
+              <w:bottom w:w="90" w:type="dxa"/>
+              <w:end w:w="120" w:type="dxa"/>
+            </w:tcMar>
           </w:tcPr>
           <w:p>
             <w:pPr>
@@ -1060,8 +1384,21 @@
         </w:tc>
         <w:tc>
           <w:tcPr>
-            <w:tcW w:type="dxa" w:w="964"/>
-            <w:shd w:val="clear" w:color="auto" w:fill="00857C"/>
+            <w:tcW w:type="dxa" w:w="1077"/>
+            <w:vAlign w:val="center"/>
+            <w:shd w:val="clear" w:color="auto" w:fill="009878"/>
+            <w:tcBorders>
+              <w:top w:val="single" w:sz="4" w:space="0" w:color="D0D0D0"/>
+              <w:left w:val="single" w:sz="4" w:space="0" w:color="D0D0D0"/>
+              <w:bottom w:val="single" w:sz="4" w:space="0" w:color="D0D0D0"/>
+              <w:right w:val="single" w:sz="4" w:space="0" w:color="D0D0D0"/>
+            </w:tcBorders>
+            <w:tcMar>
+              <w:top w:w="90" w:type="dxa"/>
+              <w:start w:w="120" w:type="dxa"/>
+              <w:bottom w:w="90" w:type="dxa"/>
+              <w:end w:w="120" w:type="dxa"/>
+            </w:tcMar>
           </w:tcPr>
           <w:p>
             <w:pPr>
@@ -1079,8 +1416,21 @@
         </w:tc>
         <w:tc>
           <w:tcPr>
-            <w:tcW w:type="dxa" w:w="1020"/>
-            <w:shd w:val="clear" w:color="auto" w:fill="00857C"/>
+            <w:tcW w:type="dxa" w:w="1134"/>
+            <w:vAlign w:val="center"/>
+            <w:shd w:val="clear" w:color="auto" w:fill="009878"/>
+            <w:tcBorders>
+              <w:top w:val="single" w:sz="4" w:space="0" w:color="D0D0D0"/>
+              <w:left w:val="single" w:sz="4" w:space="0" w:color="D0D0D0"/>
+              <w:bottom w:val="single" w:sz="4" w:space="0" w:color="D0D0D0"/>
+              <w:right w:val="single" w:sz="4" w:space="0" w:color="D0D0D0"/>
+            </w:tcBorders>
+            <w:tcMar>
+              <w:top w:w="90" w:type="dxa"/>
+              <w:start w:w="120" w:type="dxa"/>
+              <w:bottom w:w="90" w:type="dxa"/>
+              <w:end w:w="120" w:type="dxa"/>
+            </w:tcMar>
           </w:tcPr>
           <w:p>
             <w:pPr>
@@ -1098,8 +1448,21 @@
         </w:tc>
         <w:tc>
           <w:tcPr>
-            <w:tcW w:type="dxa" w:w="1247"/>
-            <w:shd w:val="clear" w:color="auto" w:fill="00857C"/>
+            <w:tcW w:type="dxa" w:w="1361"/>
+            <w:vAlign w:val="center"/>
+            <w:shd w:val="clear" w:color="auto" w:fill="009878"/>
+            <w:tcBorders>
+              <w:top w:val="single" w:sz="4" w:space="0" w:color="D0D0D0"/>
+              <w:left w:val="single" w:sz="4" w:space="0" w:color="D0D0D0"/>
+              <w:bottom w:val="single" w:sz="4" w:space="0" w:color="D0D0D0"/>
+              <w:right w:val="single" w:sz="4" w:space="0" w:color="D0D0D0"/>
+            </w:tcBorders>
+            <w:tcMar>
+              <w:top w:w="90" w:type="dxa"/>
+              <w:start w:w="120" w:type="dxa"/>
+              <w:bottom w:w="90" w:type="dxa"/>
+              <w:end w:w="120" w:type="dxa"/>
+            </w:tcMar>
           </w:tcPr>
           <w:p>
             <w:pPr>
@@ -1119,8 +1482,21 @@
       <w:tr>
         <w:tc>
           <w:tcPr>
-            <w:tcW w:type="dxa" w:w="1814"/>
+            <w:tcW w:type="dxa" w:w="2041"/>
+            <w:vAlign w:val="center"/>
             <w:shd w:val="clear" w:color="auto" w:fill="FFFFFF"/>
+            <w:tcBorders>
+              <w:top w:val="single" w:sz="4" w:space="0" w:color="D0D0D0"/>
+              <w:left w:val="single" w:sz="4" w:space="0" w:color="D0D0D0"/>
+              <w:bottom w:val="single" w:sz="4" w:space="0" w:color="D0D0D0"/>
+              <w:right w:val="single" w:sz="4" w:space="0" w:color="D0D0D0"/>
+            </w:tcBorders>
+            <w:tcMar>
+              <w:top w:w="90" w:type="dxa"/>
+              <w:start w:w="120" w:type="dxa"/>
+              <w:bottom w:w="90" w:type="dxa"/>
+              <w:end w:w="120" w:type="dxa"/>
+            </w:tcMar>
           </w:tcPr>
           <w:p>
             <w:pPr>
@@ -1136,8 +1512,21 @@
         </w:tc>
         <w:tc>
           <w:tcPr>
-            <w:tcW w:type="dxa" w:w="1247"/>
+            <w:tcW w:type="dxa" w:w="1417"/>
+            <w:vAlign w:val="center"/>
             <w:shd w:val="clear" w:color="auto" w:fill="FFFFFF"/>
+            <w:tcBorders>
+              <w:top w:val="single" w:sz="4" w:space="0" w:color="D0D0D0"/>
+              <w:left w:val="single" w:sz="4" w:space="0" w:color="D0D0D0"/>
+              <w:bottom w:val="single" w:sz="4" w:space="0" w:color="D0D0D0"/>
+              <w:right w:val="single" w:sz="4" w:space="0" w:color="D0D0D0"/>
+            </w:tcBorders>
+            <w:tcMar>
+              <w:top w:w="90" w:type="dxa"/>
+              <w:start w:w="120" w:type="dxa"/>
+              <w:bottom w:w="90" w:type="dxa"/>
+              <w:end w:w="120" w:type="dxa"/>
+            </w:tcMar>
           </w:tcPr>
           <w:p>
             <w:pPr>
@@ -1153,8 +1542,21 @@
         </w:tc>
         <w:tc>
           <w:tcPr>
-            <w:tcW w:type="dxa" w:w="850"/>
+            <w:tcW w:type="dxa" w:w="1020"/>
+            <w:vAlign w:val="center"/>
             <w:shd w:val="clear" w:color="auto" w:fill="FFFFFF"/>
+            <w:tcBorders>
+              <w:top w:val="single" w:sz="4" w:space="0" w:color="D0D0D0"/>
+              <w:left w:val="single" w:sz="4" w:space="0" w:color="D0D0D0"/>
+              <w:bottom w:val="single" w:sz="4" w:space="0" w:color="D0D0D0"/>
+              <w:right w:val="single" w:sz="4" w:space="0" w:color="D0D0D0"/>
+            </w:tcBorders>
+            <w:tcMar>
+              <w:top w:w="90" w:type="dxa"/>
+              <w:start w:w="120" w:type="dxa"/>
+              <w:bottom w:w="90" w:type="dxa"/>
+              <w:end w:w="120" w:type="dxa"/>
+            </w:tcMar>
           </w:tcPr>
           <w:p>
             <w:pPr>
@@ -1170,59 +1572,21 @@
         </w:tc>
         <w:tc>
           <w:tcPr>
-            <w:tcW w:type="dxa" w:w="850"/>
+            <w:tcW w:type="dxa" w:w="1077"/>
+            <w:vAlign w:val="center"/>
             <w:shd w:val="clear" w:color="auto" w:fill="FFFFFF"/>
-          </w:tcPr>
-          <w:p>
-            <w:pPr>
-              <w:spacing w:before="60" w:after="60"/>
-            </w:pPr>
-            <w:r>
-              <w:rPr>
-                <w:sz w:val="18"/>
-              </w:rPr>
-              <w:t>0.469</w:t>
-            </w:r>
-          </w:p>
-        </w:tc>
-        <w:tc>
-          <w:tcPr>
-            <w:tcW w:type="dxa" w:w="794"/>
-            <w:shd w:val="clear" w:color="auto" w:fill="FFFFFF"/>
-          </w:tcPr>
-          <w:p>
-            <w:pPr>
-              <w:spacing w:before="60" w:after="60"/>
-            </w:pPr>
-            <w:r>
-              <w:rPr>
-                <w:sz w:val="18"/>
-              </w:rPr>
-              <w:t>0.161</w:t>
-            </w:r>
-          </w:p>
-        </w:tc>
-        <w:tc>
-          <w:tcPr>
-            <w:tcW w:type="dxa" w:w="794"/>
-            <w:shd w:val="clear" w:color="auto" w:fill="FFFFFF"/>
-          </w:tcPr>
-          <w:p>
-            <w:pPr>
-              <w:spacing w:before="60" w:after="60"/>
-            </w:pPr>
-            <w:r>
-              <w:rPr>
-                <w:sz w:val="18"/>
-              </w:rPr>
-              <w:t>1.782</w:t>
-            </w:r>
-          </w:p>
-        </w:tc>
-        <w:tc>
-          <w:tcPr>
-            <w:tcW w:type="dxa" w:w="964"/>
-            <w:shd w:val="clear" w:color="auto" w:fill="FFFFFF"/>
+            <w:tcBorders>
+              <w:top w:val="single" w:sz="4" w:space="0" w:color="D0D0D0"/>
+              <w:left w:val="single" w:sz="4" w:space="0" w:color="D0D0D0"/>
+              <w:bottom w:val="single" w:sz="4" w:space="0" w:color="D0D0D0"/>
+              <w:right w:val="single" w:sz="4" w:space="0" w:color="D0D0D0"/>
+            </w:tcBorders>
+            <w:tcMar>
+              <w:top w:w="90" w:type="dxa"/>
+              <w:start w:w="120" w:type="dxa"/>
+              <w:bottom w:w="90" w:type="dxa"/>
+              <w:end w:w="120" w:type="dxa"/>
+            </w:tcMar>
           </w:tcPr>
           <w:p>
             <w:pPr>
@@ -1238,8 +1602,21 @@
         </w:tc>
         <w:tc>
           <w:tcPr>
-            <w:tcW w:type="dxa" w:w="964"/>
+            <w:tcW w:type="dxa" w:w="1077"/>
+            <w:vAlign w:val="center"/>
             <w:shd w:val="clear" w:color="auto" w:fill="FFFFFF"/>
+            <w:tcBorders>
+              <w:top w:val="single" w:sz="4" w:space="0" w:color="D0D0D0"/>
+              <w:left w:val="single" w:sz="4" w:space="0" w:color="D0D0D0"/>
+              <w:bottom w:val="single" w:sz="4" w:space="0" w:color="D0D0D0"/>
+              <w:right w:val="single" w:sz="4" w:space="0" w:color="D0D0D0"/>
+            </w:tcBorders>
+            <w:tcMar>
+              <w:top w:w="90" w:type="dxa"/>
+              <w:start w:w="120" w:type="dxa"/>
+              <w:bottom w:w="90" w:type="dxa"/>
+              <w:end w:w="120" w:type="dxa"/>
+            </w:tcMar>
           </w:tcPr>
           <w:p>
             <w:pPr>
@@ -1255,8 +1632,21 @@
         </w:tc>
         <w:tc>
           <w:tcPr>
-            <w:tcW w:type="dxa" w:w="1020"/>
+            <w:tcW w:type="dxa" w:w="1134"/>
+            <w:vAlign w:val="center"/>
             <w:shd w:val="clear" w:color="auto" w:fill="FFFFFF"/>
+            <w:tcBorders>
+              <w:top w:val="single" w:sz="4" w:space="0" w:color="D0D0D0"/>
+              <w:left w:val="single" w:sz="4" w:space="0" w:color="D0D0D0"/>
+              <w:bottom w:val="single" w:sz="4" w:space="0" w:color="D0D0D0"/>
+              <w:right w:val="single" w:sz="4" w:space="0" w:color="D0D0D0"/>
+            </w:tcBorders>
+            <w:tcMar>
+              <w:top w:w="90" w:type="dxa"/>
+              <w:start w:w="120" w:type="dxa"/>
+              <w:bottom w:w="90" w:type="dxa"/>
+              <w:end w:w="120" w:type="dxa"/>
+            </w:tcMar>
           </w:tcPr>
           <w:p>
             <w:pPr>
@@ -1272,8 +1662,21 @@
         </w:tc>
         <w:tc>
           <w:tcPr>
-            <w:tcW w:type="dxa" w:w="1247"/>
+            <w:tcW w:type="dxa" w:w="1361"/>
+            <w:vAlign w:val="center"/>
             <w:shd w:val="clear" w:color="auto" w:fill="FFFFFF"/>
+            <w:tcBorders>
+              <w:top w:val="single" w:sz="4" w:space="0" w:color="D0D0D0"/>
+              <w:left w:val="single" w:sz="4" w:space="0" w:color="D0D0D0"/>
+              <w:bottom w:val="single" w:sz="4" w:space="0" w:color="D0D0D0"/>
+              <w:right w:val="single" w:sz="4" w:space="0" w:color="D0D0D0"/>
+            </w:tcBorders>
+            <w:tcMar>
+              <w:top w:w="90" w:type="dxa"/>
+              <w:start w:w="120" w:type="dxa"/>
+              <w:bottom w:w="90" w:type="dxa"/>
+              <w:end w:w="120" w:type="dxa"/>
+            </w:tcMar>
           </w:tcPr>
           <w:p>
             <w:pPr>
@@ -1291,8 +1694,21 @@
       <w:tr>
         <w:tc>
           <w:tcPr>
-            <w:tcW w:type="dxa" w:w="1814"/>
-            <w:shd w:val="clear" w:color="auto" w:fill="F2F8F7"/>
+            <w:tcW w:type="dxa" w:w="2041"/>
+            <w:vAlign w:val="center"/>
+            <w:shd w:val="clear" w:color="auto" w:fill="F7F7F7"/>
+            <w:tcBorders>
+              <w:top w:val="single" w:sz="4" w:space="0" w:color="D0D0D0"/>
+              <w:left w:val="single" w:sz="4" w:space="0" w:color="D0D0D0"/>
+              <w:bottom w:val="single" w:sz="4" w:space="0" w:color="D0D0D0"/>
+              <w:right w:val="single" w:sz="4" w:space="0" w:color="D0D0D0"/>
+            </w:tcBorders>
+            <w:tcMar>
+              <w:top w:w="90" w:type="dxa"/>
+              <w:start w:w="120" w:type="dxa"/>
+              <w:bottom w:w="90" w:type="dxa"/>
+              <w:end w:w="120" w:type="dxa"/>
+            </w:tcMar>
           </w:tcPr>
           <w:p>
             <w:pPr>
@@ -1308,8 +1724,21 @@
         </w:tc>
         <w:tc>
           <w:tcPr>
-            <w:tcW w:type="dxa" w:w="1247"/>
-            <w:shd w:val="clear" w:color="auto" w:fill="F2F8F7"/>
+            <w:tcW w:type="dxa" w:w="1417"/>
+            <w:vAlign w:val="center"/>
+            <w:shd w:val="clear" w:color="auto" w:fill="F7F7F7"/>
+            <w:tcBorders>
+              <w:top w:val="single" w:sz="4" w:space="0" w:color="D0D0D0"/>
+              <w:left w:val="single" w:sz="4" w:space="0" w:color="D0D0D0"/>
+              <w:bottom w:val="single" w:sz="4" w:space="0" w:color="D0D0D0"/>
+              <w:right w:val="single" w:sz="4" w:space="0" w:color="D0D0D0"/>
+            </w:tcBorders>
+            <w:tcMar>
+              <w:top w:w="90" w:type="dxa"/>
+              <w:start w:w="120" w:type="dxa"/>
+              <w:bottom w:w="90" w:type="dxa"/>
+              <w:end w:w="120" w:type="dxa"/>
+            </w:tcMar>
           </w:tcPr>
           <w:p>
             <w:pPr>
@@ -1325,8 +1754,21 @@
         </w:tc>
         <w:tc>
           <w:tcPr>
-            <w:tcW w:type="dxa" w:w="850"/>
-            <w:shd w:val="clear" w:color="auto" w:fill="F2F8F7"/>
+            <w:tcW w:type="dxa" w:w="1020"/>
+            <w:vAlign w:val="center"/>
+            <w:shd w:val="clear" w:color="auto" w:fill="F7F7F7"/>
+            <w:tcBorders>
+              <w:top w:val="single" w:sz="4" w:space="0" w:color="D0D0D0"/>
+              <w:left w:val="single" w:sz="4" w:space="0" w:color="D0D0D0"/>
+              <w:bottom w:val="single" w:sz="4" w:space="0" w:color="D0D0D0"/>
+              <w:right w:val="single" w:sz="4" w:space="0" w:color="D0D0D0"/>
+            </w:tcBorders>
+            <w:tcMar>
+              <w:top w:w="90" w:type="dxa"/>
+              <w:start w:w="120" w:type="dxa"/>
+              <w:bottom w:w="90" w:type="dxa"/>
+              <w:end w:w="120" w:type="dxa"/>
+            </w:tcMar>
           </w:tcPr>
           <w:p>
             <w:pPr>
@@ -1342,59 +1784,21 @@
         </w:tc>
         <w:tc>
           <w:tcPr>
-            <w:tcW w:type="dxa" w:w="850"/>
-            <w:shd w:val="clear" w:color="auto" w:fill="F2F8F7"/>
-          </w:tcPr>
-          <w:p>
-            <w:pPr>
-              <w:spacing w:before="60" w:after="60"/>
-            </w:pPr>
-            <w:r>
-              <w:rPr>
-                <w:sz w:val="18"/>
-              </w:rPr>
-              <w:t>0.050</w:t>
-            </w:r>
-          </w:p>
-        </w:tc>
-        <w:tc>
-          <w:tcPr>
-            <w:tcW w:type="dxa" w:w="794"/>
-            <w:shd w:val="clear" w:color="auto" w:fill="F2F8F7"/>
-          </w:tcPr>
-          <w:p>
-            <w:pPr>
-              <w:spacing w:before="60" w:after="60"/>
-            </w:pPr>
-            <w:r>
-              <w:rPr>
-                <w:sz w:val="18"/>
-              </w:rPr>
-              <w:t>0.017</w:t>
-            </w:r>
-          </w:p>
-        </w:tc>
-        <w:tc>
-          <w:tcPr>
-            <w:tcW w:type="dxa" w:w="794"/>
-            <w:shd w:val="clear" w:color="auto" w:fill="F2F8F7"/>
-          </w:tcPr>
-          <w:p>
-            <w:pPr>
-              <w:spacing w:before="60" w:after="60"/>
-            </w:pPr>
-            <w:r>
-              <w:rPr>
-                <w:sz w:val="18"/>
-              </w:rPr>
-              <w:t>0.260</w:t>
-            </w:r>
-          </w:p>
-        </w:tc>
-        <w:tc>
-          <w:tcPr>
-            <w:tcW w:type="dxa" w:w="964"/>
-            <w:shd w:val="clear" w:color="auto" w:fill="F2F8F7"/>
+            <w:tcW w:type="dxa" w:w="1077"/>
+            <w:vAlign w:val="center"/>
+            <w:shd w:val="clear" w:color="auto" w:fill="F7F7F7"/>
+            <w:tcBorders>
+              <w:top w:val="single" w:sz="4" w:space="0" w:color="D0D0D0"/>
+              <w:left w:val="single" w:sz="4" w:space="0" w:color="D0D0D0"/>
+              <w:bottom w:val="single" w:sz="4" w:space="0" w:color="D0D0D0"/>
+              <w:right w:val="single" w:sz="4" w:space="0" w:color="D0D0D0"/>
+            </w:tcBorders>
+            <w:tcMar>
+              <w:top w:w="90" w:type="dxa"/>
+              <w:start w:w="120" w:type="dxa"/>
+              <w:bottom w:w="90" w:type="dxa"/>
+              <w:end w:w="120" w:type="dxa"/>
+            </w:tcMar>
           </w:tcPr>
           <w:p>
             <w:pPr>
@@ -1410,8 +1814,21 @@
         </w:tc>
         <w:tc>
           <w:tcPr>
-            <w:tcW w:type="dxa" w:w="964"/>
-            <w:shd w:val="clear" w:color="auto" w:fill="F2F8F7"/>
+            <w:tcW w:type="dxa" w:w="1077"/>
+            <w:vAlign w:val="center"/>
+            <w:shd w:val="clear" w:color="auto" w:fill="F7F7F7"/>
+            <w:tcBorders>
+              <w:top w:val="single" w:sz="4" w:space="0" w:color="D0D0D0"/>
+              <w:left w:val="single" w:sz="4" w:space="0" w:color="D0D0D0"/>
+              <w:bottom w:val="single" w:sz="4" w:space="0" w:color="D0D0D0"/>
+              <w:right w:val="single" w:sz="4" w:space="0" w:color="D0D0D0"/>
+            </w:tcBorders>
+            <w:tcMar>
+              <w:top w:w="90" w:type="dxa"/>
+              <w:start w:w="120" w:type="dxa"/>
+              <w:bottom w:w="90" w:type="dxa"/>
+              <w:end w:w="120" w:type="dxa"/>
+            </w:tcMar>
           </w:tcPr>
           <w:p>
             <w:pPr>
@@ -1427,8 +1844,21 @@
         </w:tc>
         <w:tc>
           <w:tcPr>
-            <w:tcW w:type="dxa" w:w="1020"/>
-            <w:shd w:val="clear" w:color="auto" w:fill="F2F8F7"/>
+            <w:tcW w:type="dxa" w:w="1134"/>
+            <w:vAlign w:val="center"/>
+            <w:shd w:val="clear" w:color="auto" w:fill="F7F7F7"/>
+            <w:tcBorders>
+              <w:top w:val="single" w:sz="4" w:space="0" w:color="D0D0D0"/>
+              <w:left w:val="single" w:sz="4" w:space="0" w:color="D0D0D0"/>
+              <w:bottom w:val="single" w:sz="4" w:space="0" w:color="D0D0D0"/>
+              <w:right w:val="single" w:sz="4" w:space="0" w:color="D0D0D0"/>
+            </w:tcBorders>
+            <w:tcMar>
+              <w:top w:w="90" w:type="dxa"/>
+              <w:start w:w="120" w:type="dxa"/>
+              <w:bottom w:w="90" w:type="dxa"/>
+              <w:end w:w="120" w:type="dxa"/>
+            </w:tcMar>
           </w:tcPr>
           <w:p>
             <w:pPr>
@@ -1444,8 +1874,21 @@
         </w:tc>
         <w:tc>
           <w:tcPr>
-            <w:tcW w:type="dxa" w:w="1247"/>
-            <w:shd w:val="clear" w:color="auto" w:fill="F2F8F7"/>
+            <w:tcW w:type="dxa" w:w="1361"/>
+            <w:vAlign w:val="center"/>
+            <w:shd w:val="clear" w:color="auto" w:fill="F7F7F7"/>
+            <w:tcBorders>
+              <w:top w:val="single" w:sz="4" w:space="0" w:color="D0D0D0"/>
+              <w:left w:val="single" w:sz="4" w:space="0" w:color="D0D0D0"/>
+              <w:bottom w:val="single" w:sz="4" w:space="0" w:color="D0D0D0"/>
+              <w:right w:val="single" w:sz="4" w:space="0" w:color="D0D0D0"/>
+            </w:tcBorders>
+            <w:tcMar>
+              <w:top w:w="90" w:type="dxa"/>
+              <w:start w:w="120" w:type="dxa"/>
+              <w:bottom w:w="90" w:type="dxa"/>
+              <w:end w:w="120" w:type="dxa"/>
+            </w:tcMar>
           </w:tcPr>
           <w:p>
             <w:pPr>
@@ -1463,8 +1906,21 @@
       <w:tr>
         <w:tc>
           <w:tcPr>
-            <w:tcW w:type="dxa" w:w="1814"/>
+            <w:tcW w:type="dxa" w:w="2041"/>
+            <w:vAlign w:val="center"/>
             <w:shd w:val="clear" w:color="auto" w:fill="FFFFFF"/>
+            <w:tcBorders>
+              <w:top w:val="single" w:sz="4" w:space="0" w:color="D0D0D0"/>
+              <w:left w:val="single" w:sz="4" w:space="0" w:color="D0D0D0"/>
+              <w:bottom w:val="single" w:sz="4" w:space="0" w:color="D0D0D0"/>
+              <w:right w:val="single" w:sz="4" w:space="0" w:color="D0D0D0"/>
+            </w:tcBorders>
+            <w:tcMar>
+              <w:top w:w="90" w:type="dxa"/>
+              <w:start w:w="120" w:type="dxa"/>
+              <w:bottom w:w="90" w:type="dxa"/>
+              <w:end w:w="120" w:type="dxa"/>
+            </w:tcMar>
           </w:tcPr>
           <w:p>
             <w:pPr>
@@ -1480,8 +1936,21 @@
         </w:tc>
         <w:tc>
           <w:tcPr>
-            <w:tcW w:type="dxa" w:w="1247"/>
+            <w:tcW w:type="dxa" w:w="1417"/>
+            <w:vAlign w:val="center"/>
             <w:shd w:val="clear" w:color="auto" w:fill="FFFFFF"/>
+            <w:tcBorders>
+              <w:top w:val="single" w:sz="4" w:space="0" w:color="D0D0D0"/>
+              <w:left w:val="single" w:sz="4" w:space="0" w:color="D0D0D0"/>
+              <w:bottom w:val="single" w:sz="4" w:space="0" w:color="D0D0D0"/>
+              <w:right w:val="single" w:sz="4" w:space="0" w:color="D0D0D0"/>
+            </w:tcBorders>
+            <w:tcMar>
+              <w:top w:w="90" w:type="dxa"/>
+              <w:start w:w="120" w:type="dxa"/>
+              <w:bottom w:w="90" w:type="dxa"/>
+              <w:end w:w="120" w:type="dxa"/>
+            </w:tcMar>
           </w:tcPr>
           <w:p>
             <w:pPr>
@@ -1497,8 +1966,21 @@
         </w:tc>
         <w:tc>
           <w:tcPr>
-            <w:tcW w:type="dxa" w:w="850"/>
+            <w:tcW w:type="dxa" w:w="1020"/>
+            <w:vAlign w:val="center"/>
             <w:shd w:val="clear" w:color="auto" w:fill="FFFFFF"/>
+            <w:tcBorders>
+              <w:top w:val="single" w:sz="4" w:space="0" w:color="D0D0D0"/>
+              <w:left w:val="single" w:sz="4" w:space="0" w:color="D0D0D0"/>
+              <w:bottom w:val="single" w:sz="4" w:space="0" w:color="D0D0D0"/>
+              <w:right w:val="single" w:sz="4" w:space="0" w:color="D0D0D0"/>
+            </w:tcBorders>
+            <w:tcMar>
+              <w:top w:w="90" w:type="dxa"/>
+              <w:start w:w="120" w:type="dxa"/>
+              <w:bottom w:w="90" w:type="dxa"/>
+              <w:end w:w="120" w:type="dxa"/>
+            </w:tcMar>
           </w:tcPr>
           <w:p>
             <w:pPr>
@@ -1514,59 +1996,21 @@
         </w:tc>
         <w:tc>
           <w:tcPr>
-            <w:tcW w:type="dxa" w:w="850"/>
+            <w:tcW w:type="dxa" w:w="1077"/>
+            <w:vAlign w:val="center"/>
             <w:shd w:val="clear" w:color="auto" w:fill="FFFFFF"/>
-          </w:tcPr>
-          <w:p>
-            <w:pPr>
-              <w:spacing w:before="60" w:after="60"/>
-            </w:pPr>
-            <w:r>
-              <w:rPr>
-                <w:sz w:val="18"/>
-              </w:rPr>
-              <w:t>22.283</w:t>
-            </w:r>
-          </w:p>
-        </w:tc>
-        <w:tc>
-          <w:tcPr>
-            <w:tcW w:type="dxa" w:w="794"/>
-            <w:shd w:val="clear" w:color="auto" w:fill="FFFFFF"/>
-          </w:tcPr>
-          <w:p>
-            <w:pPr>
-              <w:spacing w:before="60" w:after="60"/>
-            </w:pPr>
-            <w:r>
-              <w:rPr>
-                <w:sz w:val="18"/>
-              </w:rPr>
-              <w:t>27.924</w:t>
-            </w:r>
-          </w:p>
-        </w:tc>
-        <w:tc>
-          <w:tcPr>
-            <w:tcW w:type="dxa" w:w="794"/>
-            <w:shd w:val="clear" w:color="auto" w:fill="FFFFFF"/>
-          </w:tcPr>
-          <w:p>
-            <w:pPr>
-              <w:spacing w:before="60" w:after="60"/>
-            </w:pPr>
-            <w:r>
-              <w:rPr>
-                <w:sz w:val="18"/>
-              </w:rPr>
-              <w:t>85.742</w:t>
-            </w:r>
-          </w:p>
-        </w:tc>
-        <w:tc>
-          <w:tcPr>
-            <w:tcW w:type="dxa" w:w="964"/>
-            <w:shd w:val="clear" w:color="auto" w:fill="FFFFFF"/>
+            <w:tcBorders>
+              <w:top w:val="single" w:sz="4" w:space="0" w:color="D0D0D0"/>
+              <w:left w:val="single" w:sz="4" w:space="0" w:color="D0D0D0"/>
+              <w:bottom w:val="single" w:sz="4" w:space="0" w:color="D0D0D0"/>
+              <w:right w:val="single" w:sz="4" w:space="0" w:color="D0D0D0"/>
+            </w:tcBorders>
+            <w:tcMar>
+              <w:top w:w="90" w:type="dxa"/>
+              <w:start w:w="120" w:type="dxa"/>
+              <w:bottom w:w="90" w:type="dxa"/>
+              <w:end w:w="120" w:type="dxa"/>
+            </w:tcMar>
           </w:tcPr>
           <w:p>
             <w:pPr>
@@ -1582,8 +2026,21 @@
         </w:tc>
         <w:tc>
           <w:tcPr>
-            <w:tcW w:type="dxa" w:w="964"/>
+            <w:tcW w:type="dxa" w:w="1077"/>
+            <w:vAlign w:val="center"/>
             <w:shd w:val="clear" w:color="auto" w:fill="FFFFFF"/>
+            <w:tcBorders>
+              <w:top w:val="single" w:sz="4" w:space="0" w:color="D0D0D0"/>
+              <w:left w:val="single" w:sz="4" w:space="0" w:color="D0D0D0"/>
+              <w:bottom w:val="single" w:sz="4" w:space="0" w:color="D0D0D0"/>
+              <w:right w:val="single" w:sz="4" w:space="0" w:color="D0D0D0"/>
+            </w:tcBorders>
+            <w:tcMar>
+              <w:top w:w="90" w:type="dxa"/>
+              <w:start w:w="120" w:type="dxa"/>
+              <w:bottom w:w="90" w:type="dxa"/>
+              <w:end w:w="120" w:type="dxa"/>
+            </w:tcMar>
           </w:tcPr>
           <w:p>
             <w:pPr>
@@ -1599,8 +2056,21 @@
         </w:tc>
         <w:tc>
           <w:tcPr>
-            <w:tcW w:type="dxa" w:w="1020"/>
+            <w:tcW w:type="dxa" w:w="1134"/>
+            <w:vAlign w:val="center"/>
             <w:shd w:val="clear" w:color="auto" w:fill="FFFFFF"/>
+            <w:tcBorders>
+              <w:top w:val="single" w:sz="4" w:space="0" w:color="D0D0D0"/>
+              <w:left w:val="single" w:sz="4" w:space="0" w:color="D0D0D0"/>
+              <w:bottom w:val="single" w:sz="4" w:space="0" w:color="D0D0D0"/>
+              <w:right w:val="single" w:sz="4" w:space="0" w:color="D0D0D0"/>
+            </w:tcBorders>
+            <w:tcMar>
+              <w:top w:w="90" w:type="dxa"/>
+              <w:start w:w="120" w:type="dxa"/>
+              <w:bottom w:w="90" w:type="dxa"/>
+              <w:end w:w="120" w:type="dxa"/>
+            </w:tcMar>
           </w:tcPr>
           <w:p>
             <w:pPr>
@@ -1616,8 +2086,21 @@
         </w:tc>
         <w:tc>
           <w:tcPr>
-            <w:tcW w:type="dxa" w:w="1247"/>
+            <w:tcW w:type="dxa" w:w="1361"/>
+            <w:vAlign w:val="center"/>
             <w:shd w:val="clear" w:color="auto" w:fill="FFFFFF"/>
+            <w:tcBorders>
+              <w:top w:val="single" w:sz="4" w:space="0" w:color="D0D0D0"/>
+              <w:left w:val="single" w:sz="4" w:space="0" w:color="D0D0D0"/>
+              <w:bottom w:val="single" w:sz="4" w:space="0" w:color="D0D0D0"/>
+              <w:right w:val="single" w:sz="4" w:space="0" w:color="D0D0D0"/>
+            </w:tcBorders>
+            <w:tcMar>
+              <w:top w:w="90" w:type="dxa"/>
+              <w:start w:w="120" w:type="dxa"/>
+              <w:bottom w:w="90" w:type="dxa"/>
+              <w:end w:w="120" w:type="dxa"/>
+            </w:tcMar>
           </w:tcPr>
           <w:p>
             <w:pPr>
@@ -1635,8 +2118,21 @@
       <w:tr>
         <w:tc>
           <w:tcPr>
-            <w:tcW w:type="dxa" w:w="1814"/>
-            <w:shd w:val="clear" w:color="auto" w:fill="F2F8F7"/>
+            <w:tcW w:type="dxa" w:w="2041"/>
+            <w:vAlign w:val="center"/>
+            <w:shd w:val="clear" w:color="auto" w:fill="F7F7F7"/>
+            <w:tcBorders>
+              <w:top w:val="single" w:sz="4" w:space="0" w:color="D0D0D0"/>
+              <w:left w:val="single" w:sz="4" w:space="0" w:color="D0D0D0"/>
+              <w:bottom w:val="single" w:sz="4" w:space="0" w:color="D0D0D0"/>
+              <w:right w:val="single" w:sz="4" w:space="0" w:color="D0D0D0"/>
+            </w:tcBorders>
+            <w:tcMar>
+              <w:top w:w="90" w:type="dxa"/>
+              <w:start w:w="120" w:type="dxa"/>
+              <w:bottom w:w="90" w:type="dxa"/>
+              <w:end w:w="120" w:type="dxa"/>
+            </w:tcMar>
           </w:tcPr>
           <w:p>
             <w:pPr>
@@ -1652,8 +2148,21 @@
         </w:tc>
         <w:tc>
           <w:tcPr>
-            <w:tcW w:type="dxa" w:w="1247"/>
-            <w:shd w:val="clear" w:color="auto" w:fill="F2F8F7"/>
+            <w:tcW w:type="dxa" w:w="1417"/>
+            <w:vAlign w:val="center"/>
+            <w:shd w:val="clear" w:color="auto" w:fill="F7F7F7"/>
+            <w:tcBorders>
+              <w:top w:val="single" w:sz="4" w:space="0" w:color="D0D0D0"/>
+              <w:left w:val="single" w:sz="4" w:space="0" w:color="D0D0D0"/>
+              <w:bottom w:val="single" w:sz="4" w:space="0" w:color="D0D0D0"/>
+              <w:right w:val="single" w:sz="4" w:space="0" w:color="D0D0D0"/>
+            </w:tcBorders>
+            <w:tcMar>
+              <w:top w:w="90" w:type="dxa"/>
+              <w:start w:w="120" w:type="dxa"/>
+              <w:bottom w:w="90" w:type="dxa"/>
+              <w:end w:w="120" w:type="dxa"/>
+            </w:tcMar>
           </w:tcPr>
           <w:p>
             <w:pPr>
@@ -1669,8 +2178,21 @@
         </w:tc>
         <w:tc>
           <w:tcPr>
-            <w:tcW w:type="dxa" w:w="850"/>
-            <w:shd w:val="clear" w:color="auto" w:fill="F2F8F7"/>
+            <w:tcW w:type="dxa" w:w="1020"/>
+            <w:vAlign w:val="center"/>
+            <w:shd w:val="clear" w:color="auto" w:fill="F7F7F7"/>
+            <w:tcBorders>
+              <w:top w:val="single" w:sz="4" w:space="0" w:color="D0D0D0"/>
+              <w:left w:val="single" w:sz="4" w:space="0" w:color="D0D0D0"/>
+              <w:bottom w:val="single" w:sz="4" w:space="0" w:color="D0D0D0"/>
+              <w:right w:val="single" w:sz="4" w:space="0" w:color="D0D0D0"/>
+            </w:tcBorders>
+            <w:tcMar>
+              <w:top w:w="90" w:type="dxa"/>
+              <w:start w:w="120" w:type="dxa"/>
+              <w:bottom w:w="90" w:type="dxa"/>
+              <w:end w:w="120" w:type="dxa"/>
+            </w:tcMar>
           </w:tcPr>
           <w:p>
             <w:pPr>
@@ -1686,59 +2208,21 @@
         </w:tc>
         <w:tc>
           <w:tcPr>
-            <w:tcW w:type="dxa" w:w="850"/>
-            <w:shd w:val="clear" w:color="auto" w:fill="F2F8F7"/>
-          </w:tcPr>
-          <w:p>
-            <w:pPr>
-              <w:spacing w:before="60" w:after="60"/>
-            </w:pPr>
-            <w:r>
-              <w:rPr>
-                <w:sz w:val="18"/>
-              </w:rPr>
-              <w:t>230.617</w:t>
-            </w:r>
-          </w:p>
-        </w:tc>
-        <w:tc>
-          <w:tcPr>
-            <w:tcW w:type="dxa" w:w="794"/>
-            <w:shd w:val="clear" w:color="auto" w:fill="F2F8F7"/>
-          </w:tcPr>
-          <w:p>
-            <w:pPr>
-              <w:spacing w:before="60" w:after="60"/>
-            </w:pPr>
-            <w:r>
-              <w:rPr>
-                <w:sz w:val="18"/>
-              </w:rPr>
-              <w:t>316.970</w:t>
-            </w:r>
-          </w:p>
-        </w:tc>
-        <w:tc>
-          <w:tcPr>
-            <w:tcW w:type="dxa" w:w="794"/>
-            <w:shd w:val="clear" w:color="auto" w:fill="F2F8F7"/>
-          </w:tcPr>
-          <w:p>
-            <w:pPr>
-              <w:spacing w:before="60" w:after="60"/>
-            </w:pPr>
-            <w:r>
-              <w:rPr>
-                <w:sz w:val="18"/>
-              </w:rPr>
-              <w:t>1038.476</w:t>
-            </w:r>
-          </w:p>
-        </w:tc>
-        <w:tc>
-          <w:tcPr>
-            <w:tcW w:type="dxa" w:w="964"/>
-            <w:shd w:val="clear" w:color="auto" w:fill="F2F8F7"/>
+            <w:tcW w:type="dxa" w:w="1077"/>
+            <w:vAlign w:val="center"/>
+            <w:shd w:val="clear" w:color="auto" w:fill="F7F7F7"/>
+            <w:tcBorders>
+              <w:top w:val="single" w:sz="4" w:space="0" w:color="D0D0D0"/>
+              <w:left w:val="single" w:sz="4" w:space="0" w:color="D0D0D0"/>
+              <w:bottom w:val="single" w:sz="4" w:space="0" w:color="D0D0D0"/>
+              <w:right w:val="single" w:sz="4" w:space="0" w:color="D0D0D0"/>
+            </w:tcBorders>
+            <w:tcMar>
+              <w:top w:w="90" w:type="dxa"/>
+              <w:start w:w="120" w:type="dxa"/>
+              <w:bottom w:w="90" w:type="dxa"/>
+              <w:end w:w="120" w:type="dxa"/>
+            </w:tcMar>
           </w:tcPr>
           <w:p>
             <w:pPr>
@@ -1754,8 +2238,21 @@
         </w:tc>
         <w:tc>
           <w:tcPr>
-            <w:tcW w:type="dxa" w:w="964"/>
-            <w:shd w:val="clear" w:color="auto" w:fill="F2F8F7"/>
+            <w:tcW w:type="dxa" w:w="1077"/>
+            <w:vAlign w:val="center"/>
+            <w:shd w:val="clear" w:color="auto" w:fill="F7F7F7"/>
+            <w:tcBorders>
+              <w:top w:val="single" w:sz="4" w:space="0" w:color="D0D0D0"/>
+              <w:left w:val="single" w:sz="4" w:space="0" w:color="D0D0D0"/>
+              <w:bottom w:val="single" w:sz="4" w:space="0" w:color="D0D0D0"/>
+              <w:right w:val="single" w:sz="4" w:space="0" w:color="D0D0D0"/>
+            </w:tcBorders>
+            <w:tcMar>
+              <w:top w:w="90" w:type="dxa"/>
+              <w:start w:w="120" w:type="dxa"/>
+              <w:bottom w:w="90" w:type="dxa"/>
+              <w:end w:w="120" w:type="dxa"/>
+            </w:tcMar>
           </w:tcPr>
           <w:p>
             <w:pPr>
@@ -1771,8 +2268,21 @@
         </w:tc>
         <w:tc>
           <w:tcPr>
-            <w:tcW w:type="dxa" w:w="1020"/>
-            <w:shd w:val="clear" w:color="auto" w:fill="F2F8F7"/>
+            <w:tcW w:type="dxa" w:w="1134"/>
+            <w:vAlign w:val="center"/>
+            <w:shd w:val="clear" w:color="auto" w:fill="F7F7F7"/>
+            <w:tcBorders>
+              <w:top w:val="single" w:sz="4" w:space="0" w:color="D0D0D0"/>
+              <w:left w:val="single" w:sz="4" w:space="0" w:color="D0D0D0"/>
+              <w:bottom w:val="single" w:sz="4" w:space="0" w:color="D0D0D0"/>
+              <w:right w:val="single" w:sz="4" w:space="0" w:color="D0D0D0"/>
+            </w:tcBorders>
+            <w:tcMar>
+              <w:top w:w="90" w:type="dxa"/>
+              <w:start w:w="120" w:type="dxa"/>
+              <w:bottom w:w="90" w:type="dxa"/>
+              <w:end w:w="120" w:type="dxa"/>
+            </w:tcMar>
           </w:tcPr>
           <w:p>
             <w:pPr>
@@ -1788,8 +2298,21 @@
         </w:tc>
         <w:tc>
           <w:tcPr>
-            <w:tcW w:type="dxa" w:w="1247"/>
-            <w:shd w:val="clear" w:color="auto" w:fill="F2F8F7"/>
+            <w:tcW w:type="dxa" w:w="1361"/>
+            <w:vAlign w:val="center"/>
+            <w:shd w:val="clear" w:color="auto" w:fill="F7F7F7"/>
+            <w:tcBorders>
+              <w:top w:val="single" w:sz="4" w:space="0" w:color="D0D0D0"/>
+              <w:left w:val="single" w:sz="4" w:space="0" w:color="D0D0D0"/>
+              <w:bottom w:val="single" w:sz="4" w:space="0" w:color="D0D0D0"/>
+              <w:right w:val="single" w:sz="4" w:space="0" w:color="D0D0D0"/>
+            </w:tcBorders>
+            <w:tcMar>
+              <w:top w:w="90" w:type="dxa"/>
+              <w:start w:w="120" w:type="dxa"/>
+              <w:bottom w:w="90" w:type="dxa"/>
+              <w:end w:w="120" w:type="dxa"/>
+            </w:tcMar>
           </w:tcPr>
           <w:p>
             <w:pPr>
@@ -1807,8 +2330,21 @@
       <w:tr>
         <w:tc>
           <w:tcPr>
-            <w:tcW w:type="dxa" w:w="1814"/>
+            <w:tcW w:type="dxa" w:w="2041"/>
+            <w:vAlign w:val="center"/>
             <w:shd w:val="clear" w:color="auto" w:fill="FFFFFF"/>
+            <w:tcBorders>
+              <w:top w:val="single" w:sz="4" w:space="0" w:color="D0D0D0"/>
+              <w:left w:val="single" w:sz="4" w:space="0" w:color="D0D0D0"/>
+              <w:bottom w:val="single" w:sz="4" w:space="0" w:color="D0D0D0"/>
+              <w:right w:val="single" w:sz="4" w:space="0" w:color="D0D0D0"/>
+            </w:tcBorders>
+            <w:tcMar>
+              <w:top w:w="90" w:type="dxa"/>
+              <w:start w:w="120" w:type="dxa"/>
+              <w:bottom w:w="90" w:type="dxa"/>
+              <w:end w:w="120" w:type="dxa"/>
+            </w:tcMar>
           </w:tcPr>
           <w:p>
             <w:pPr>
@@ -1824,8 +2360,21 @@
         </w:tc>
         <w:tc>
           <w:tcPr>
-            <w:tcW w:type="dxa" w:w="1247"/>
+            <w:tcW w:type="dxa" w:w="1417"/>
+            <w:vAlign w:val="center"/>
             <w:shd w:val="clear" w:color="auto" w:fill="FFFFFF"/>
+            <w:tcBorders>
+              <w:top w:val="single" w:sz="4" w:space="0" w:color="D0D0D0"/>
+              <w:left w:val="single" w:sz="4" w:space="0" w:color="D0D0D0"/>
+              <w:bottom w:val="single" w:sz="4" w:space="0" w:color="D0D0D0"/>
+              <w:right w:val="single" w:sz="4" w:space="0" w:color="D0D0D0"/>
+            </w:tcBorders>
+            <w:tcMar>
+              <w:top w:w="90" w:type="dxa"/>
+              <w:start w:w="120" w:type="dxa"/>
+              <w:bottom w:w="90" w:type="dxa"/>
+              <w:end w:w="120" w:type="dxa"/>
+            </w:tcMar>
           </w:tcPr>
           <w:p>
             <w:pPr>
@@ -1841,8 +2390,21 @@
         </w:tc>
         <w:tc>
           <w:tcPr>
-            <w:tcW w:type="dxa" w:w="850"/>
+            <w:tcW w:type="dxa" w:w="1020"/>
+            <w:vAlign w:val="center"/>
             <w:shd w:val="clear" w:color="auto" w:fill="FFFFFF"/>
+            <w:tcBorders>
+              <w:top w:val="single" w:sz="4" w:space="0" w:color="D0D0D0"/>
+              <w:left w:val="single" w:sz="4" w:space="0" w:color="D0D0D0"/>
+              <w:bottom w:val="single" w:sz="4" w:space="0" w:color="D0D0D0"/>
+              <w:right w:val="single" w:sz="4" w:space="0" w:color="D0D0D0"/>
+            </w:tcBorders>
+            <w:tcMar>
+              <w:top w:w="90" w:type="dxa"/>
+              <w:start w:w="120" w:type="dxa"/>
+              <w:bottom w:w="90" w:type="dxa"/>
+              <w:end w:w="120" w:type="dxa"/>
+            </w:tcMar>
           </w:tcPr>
           <w:p>
             <w:pPr>
@@ -1858,59 +2420,21 @@
         </w:tc>
         <w:tc>
           <w:tcPr>
-            <w:tcW w:type="dxa" w:w="850"/>
+            <w:tcW w:type="dxa" w:w="1077"/>
+            <w:vAlign w:val="center"/>
             <w:shd w:val="clear" w:color="auto" w:fill="FFFFFF"/>
-          </w:tcPr>
-          <w:p>
-            <w:pPr>
-              <w:spacing w:before="60" w:after="60"/>
-            </w:pPr>
-            <w:r>
-              <w:rPr>
-                <w:sz w:val="18"/>
-              </w:rPr>
-              <w:t>0.115</w:t>
-            </w:r>
-          </w:p>
-        </w:tc>
-        <w:tc>
-          <w:tcPr>
-            <w:tcW w:type="dxa" w:w="794"/>
-            <w:shd w:val="clear" w:color="auto" w:fill="FFFFFF"/>
-          </w:tcPr>
-          <w:p>
-            <w:pPr>
-              <w:spacing w:before="60" w:after="60"/>
-            </w:pPr>
-            <w:r>
-              <w:rPr>
-                <w:sz w:val="18"/>
-              </w:rPr>
-              <w:t>8.403</w:t>
-            </w:r>
-          </w:p>
-        </w:tc>
-        <w:tc>
-          <w:tcPr>
-            <w:tcW w:type="dxa" w:w="794"/>
-            <w:shd w:val="clear" w:color="auto" w:fill="FFFFFF"/>
-          </w:tcPr>
-          <w:p>
-            <w:pPr>
-              <w:spacing w:before="60" w:after="60"/>
-            </w:pPr>
-            <w:r>
-              <w:rPr>
-                <w:sz w:val="18"/>
-              </w:rPr>
-              <w:t>8.947</w:t>
-            </w:r>
-          </w:p>
-        </w:tc>
-        <w:tc>
-          <w:tcPr>
-            <w:tcW w:type="dxa" w:w="964"/>
-            <w:shd w:val="clear" w:color="auto" w:fill="FFFFFF"/>
+            <w:tcBorders>
+              <w:top w:val="single" w:sz="4" w:space="0" w:color="D0D0D0"/>
+              <w:left w:val="single" w:sz="4" w:space="0" w:color="D0D0D0"/>
+              <w:bottom w:val="single" w:sz="4" w:space="0" w:color="D0D0D0"/>
+              <w:right w:val="single" w:sz="4" w:space="0" w:color="D0D0D0"/>
+            </w:tcBorders>
+            <w:tcMar>
+              <w:top w:w="90" w:type="dxa"/>
+              <w:start w:w="120" w:type="dxa"/>
+              <w:bottom w:w="90" w:type="dxa"/>
+              <w:end w:w="120" w:type="dxa"/>
+            </w:tcMar>
           </w:tcPr>
           <w:p>
             <w:pPr>
@@ -1926,8 +2450,21 @@
         </w:tc>
         <w:tc>
           <w:tcPr>
-            <w:tcW w:type="dxa" w:w="964"/>
+            <w:tcW w:type="dxa" w:w="1077"/>
+            <w:vAlign w:val="center"/>
             <w:shd w:val="clear" w:color="auto" w:fill="FFFFFF"/>
+            <w:tcBorders>
+              <w:top w:val="single" w:sz="4" w:space="0" w:color="D0D0D0"/>
+              <w:left w:val="single" w:sz="4" w:space="0" w:color="D0D0D0"/>
+              <w:bottom w:val="single" w:sz="4" w:space="0" w:color="D0D0D0"/>
+              <w:right w:val="single" w:sz="4" w:space="0" w:color="D0D0D0"/>
+            </w:tcBorders>
+            <w:tcMar>
+              <w:top w:w="90" w:type="dxa"/>
+              <w:start w:w="120" w:type="dxa"/>
+              <w:bottom w:w="90" w:type="dxa"/>
+              <w:end w:w="120" w:type="dxa"/>
+            </w:tcMar>
           </w:tcPr>
           <w:p>
             <w:pPr>
@@ -1943,8 +2480,21 @@
         </w:tc>
         <w:tc>
           <w:tcPr>
-            <w:tcW w:type="dxa" w:w="1020"/>
+            <w:tcW w:type="dxa" w:w="1134"/>
+            <w:vAlign w:val="center"/>
             <w:shd w:val="clear" w:color="auto" w:fill="FFFFFF"/>
+            <w:tcBorders>
+              <w:top w:val="single" w:sz="4" w:space="0" w:color="D0D0D0"/>
+              <w:left w:val="single" w:sz="4" w:space="0" w:color="D0D0D0"/>
+              <w:bottom w:val="single" w:sz="4" w:space="0" w:color="D0D0D0"/>
+              <w:right w:val="single" w:sz="4" w:space="0" w:color="D0D0D0"/>
+            </w:tcBorders>
+            <w:tcMar>
+              <w:top w:w="90" w:type="dxa"/>
+              <w:start w:w="120" w:type="dxa"/>
+              <w:bottom w:w="90" w:type="dxa"/>
+              <w:end w:w="120" w:type="dxa"/>
+            </w:tcMar>
           </w:tcPr>
           <w:p>
             <w:pPr>
@@ -1960,8 +2510,21 @@
         </w:tc>
         <w:tc>
           <w:tcPr>
-            <w:tcW w:type="dxa" w:w="1247"/>
+            <w:tcW w:type="dxa" w:w="1361"/>
+            <w:vAlign w:val="center"/>
             <w:shd w:val="clear" w:color="auto" w:fill="FFFFFF"/>
+            <w:tcBorders>
+              <w:top w:val="single" w:sz="4" w:space="0" w:color="D0D0D0"/>
+              <w:left w:val="single" w:sz="4" w:space="0" w:color="D0D0D0"/>
+              <w:bottom w:val="single" w:sz="4" w:space="0" w:color="D0D0D0"/>
+              <w:right w:val="single" w:sz="4" w:space="0" w:color="D0D0D0"/>
+            </w:tcBorders>
+            <w:tcMar>
+              <w:top w:w="90" w:type="dxa"/>
+              <w:start w:w="120" w:type="dxa"/>
+              <w:bottom w:w="90" w:type="dxa"/>
+              <w:end w:w="120" w:type="dxa"/>
+            </w:tcMar>
           </w:tcPr>
           <w:p>
             <w:pPr>
@@ -1971,7 +2534,7 @@
               <w:rPr>
                 <w:sz w:val="18"/>
               </w:rPr>
-              <w:t>ℹ Info</w:t>
+              <w:t>✓ Excellent</w:t>
             </w:r>
           </w:p>
         </w:tc>
@@ -1979,8 +2542,21 @@
       <w:tr>
         <w:tc>
           <w:tcPr>
-            <w:tcW w:type="dxa" w:w="1814"/>
-            <w:shd w:val="clear" w:color="auto" w:fill="F2F8F7"/>
+            <w:tcW w:type="dxa" w:w="2041"/>
+            <w:vAlign w:val="center"/>
+            <w:shd w:val="clear" w:color="auto" w:fill="F7F7F7"/>
+            <w:tcBorders>
+              <w:top w:val="single" w:sz="4" w:space="0" w:color="D0D0D0"/>
+              <w:left w:val="single" w:sz="4" w:space="0" w:color="D0D0D0"/>
+              <w:bottom w:val="single" w:sz="4" w:space="0" w:color="D0D0D0"/>
+              <w:right w:val="single" w:sz="4" w:space="0" w:color="D0D0D0"/>
+            </w:tcBorders>
+            <w:tcMar>
+              <w:top w:w="90" w:type="dxa"/>
+              <w:start w:w="120" w:type="dxa"/>
+              <w:bottom w:w="90" w:type="dxa"/>
+              <w:end w:w="120" w:type="dxa"/>
+            </w:tcMar>
           </w:tcPr>
           <w:p>
             <w:pPr>
@@ -1990,14 +2566,27 @@
               <w:rPr>
                 <w:sz w:val="18"/>
               </w:rPr>
-              <w:t>ORP (mV)</w:t>
+              <w:t>Turbidity (NTU)</w:t>
             </w:r>
           </w:p>
         </w:tc>
         <w:tc>
           <w:tcPr>
-            <w:tcW w:type="dxa" w:w="1247"/>
-            <w:shd w:val="clear" w:color="auto" w:fill="F2F8F7"/>
+            <w:tcW w:type="dxa" w:w="1417"/>
+            <w:vAlign w:val="center"/>
+            <w:shd w:val="clear" w:color="auto" w:fill="F7F7F7"/>
+            <w:tcBorders>
+              <w:top w:val="single" w:sz="4" w:space="0" w:color="D0D0D0"/>
+              <w:left w:val="single" w:sz="4" w:space="0" w:color="D0D0D0"/>
+              <w:bottom w:val="single" w:sz="4" w:space="0" w:color="D0D0D0"/>
+              <w:right w:val="single" w:sz="4" w:space="0" w:color="D0D0D0"/>
+            </w:tcBorders>
+            <w:tcMar>
+              <w:top w:w="90" w:type="dxa"/>
+              <w:start w:w="120" w:type="dxa"/>
+              <w:bottom w:w="90" w:type="dxa"/>
+              <w:end w:w="120" w:type="dxa"/>
+            </w:tcMar>
           </w:tcPr>
           <w:p>
             <w:pPr>
@@ -2013,8 +2602,21 @@
         </w:tc>
         <w:tc>
           <w:tcPr>
-            <w:tcW w:type="dxa" w:w="850"/>
-            <w:shd w:val="clear" w:color="auto" w:fill="F2F8F7"/>
+            <w:tcW w:type="dxa" w:w="1020"/>
+            <w:vAlign w:val="center"/>
+            <w:shd w:val="clear" w:color="auto" w:fill="F7F7F7"/>
+            <w:tcBorders>
+              <w:top w:val="single" w:sz="4" w:space="0" w:color="D0D0D0"/>
+              <w:left w:val="single" w:sz="4" w:space="0" w:color="D0D0D0"/>
+              <w:bottom w:val="single" w:sz="4" w:space="0" w:color="D0D0D0"/>
+              <w:right w:val="single" w:sz="4" w:space="0" w:color="D0D0D0"/>
+            </w:tcBorders>
+            <w:tcMar>
+              <w:top w:w="90" w:type="dxa"/>
+              <w:start w:w="120" w:type="dxa"/>
+              <w:bottom w:w="90" w:type="dxa"/>
+              <w:end w:w="120" w:type="dxa"/>
+            </w:tcMar>
           </w:tcPr>
           <w:p>
             <w:pPr>
@@ -2024,14 +2626,27 @@
               <w:rPr>
                 <w:sz w:val="18"/>
               </w:rPr>
-              <w:t>225.316</w:t>
+              <w:t>14.865</w:t>
             </w:r>
           </w:p>
         </w:tc>
         <w:tc>
           <w:tcPr>
-            <w:tcW w:type="dxa" w:w="850"/>
-            <w:shd w:val="clear" w:color="auto" w:fill="F2F8F7"/>
+            <w:tcW w:type="dxa" w:w="1077"/>
+            <w:vAlign w:val="center"/>
+            <w:shd w:val="clear" w:color="auto" w:fill="F7F7F7"/>
+            <w:tcBorders>
+              <w:top w:val="single" w:sz="4" w:space="0" w:color="D0D0D0"/>
+              <w:left w:val="single" w:sz="4" w:space="0" w:color="D0D0D0"/>
+              <w:bottom w:val="single" w:sz="4" w:space="0" w:color="D0D0D0"/>
+              <w:right w:val="single" w:sz="4" w:space="0" w:color="D0D0D0"/>
+            </w:tcBorders>
+            <w:tcMar>
+              <w:top w:w="90" w:type="dxa"/>
+              <w:start w:w="120" w:type="dxa"/>
+              <w:bottom w:w="90" w:type="dxa"/>
+              <w:end w:w="120" w:type="dxa"/>
+            </w:tcMar>
           </w:tcPr>
           <w:p>
             <w:pPr>
@@ -2041,14 +2656,27 @@
               <w:rPr>
                 <w:sz w:val="18"/>
               </w:rPr>
-              <w:t>87.630</w:t>
+              <w:t>0.0</w:t>
             </w:r>
           </w:p>
         </w:tc>
         <w:tc>
           <w:tcPr>
-            <w:tcW w:type="dxa" w:w="794"/>
-            <w:shd w:val="clear" w:color="auto" w:fill="F2F8F7"/>
+            <w:tcW w:type="dxa" w:w="1077"/>
+            <w:vAlign w:val="center"/>
+            <w:shd w:val="clear" w:color="auto" w:fill="F7F7F7"/>
+            <w:tcBorders>
+              <w:top w:val="single" w:sz="4" w:space="0" w:color="D0D0D0"/>
+              <w:left w:val="single" w:sz="4" w:space="0" w:color="D0D0D0"/>
+              <w:bottom w:val="single" w:sz="4" w:space="0" w:color="D0D0D0"/>
+              <w:right w:val="single" w:sz="4" w:space="0" w:color="D0D0D0"/>
+            </w:tcBorders>
+            <w:tcMar>
+              <w:top w:w="90" w:type="dxa"/>
+              <w:start w:w="120" w:type="dxa"/>
+              <w:bottom w:w="90" w:type="dxa"/>
+              <w:end w:w="120" w:type="dxa"/>
+            </w:tcMar>
           </w:tcPr>
           <w:p>
             <w:pPr>
@@ -2058,14 +2686,27 @@
               <w:rPr>
                 <w:sz w:val="18"/>
               </w:rPr>
-              <w:t>108.154</w:t>
+              <w:t>75.0</w:t>
             </w:r>
           </w:p>
         </w:tc>
         <w:tc>
           <w:tcPr>
-            <w:tcW w:type="dxa" w:w="794"/>
-            <w:shd w:val="clear" w:color="auto" w:fill="F2F8F7"/>
+            <w:tcW w:type="dxa" w:w="1134"/>
+            <w:vAlign w:val="center"/>
+            <w:shd w:val="clear" w:color="auto" w:fill="F7F7F7"/>
+            <w:tcBorders>
+              <w:top w:val="single" w:sz="4" w:space="0" w:color="D0D0D0"/>
+              <w:left w:val="single" w:sz="4" w:space="0" w:color="D0D0D0"/>
+              <w:bottom w:val="single" w:sz="4" w:space="0" w:color="D0D0D0"/>
+              <w:right w:val="single" w:sz="4" w:space="0" w:color="D0D0D0"/>
+            </w:tcBorders>
+            <w:tcMar>
+              <w:top w:w="90" w:type="dxa"/>
+              <w:start w:w="120" w:type="dxa"/>
+              <w:bottom w:w="90" w:type="dxa"/>
+              <w:end w:w="120" w:type="dxa"/>
+            </w:tcMar>
           </w:tcPr>
           <w:p>
             <w:pPr>
@@ -2075,14 +2716,27 @@
               <w:rPr>
                 <w:sz w:val="18"/>
               </w:rPr>
-              <w:t>378.485</w:t>
+              <w:t>100.0%</w:t>
             </w:r>
           </w:p>
         </w:tc>
         <w:tc>
           <w:tcPr>
-            <w:tcW w:type="dxa" w:w="964"/>
-            <w:shd w:val="clear" w:color="auto" w:fill="F2F8F7"/>
+            <w:tcW w:type="dxa" w:w="1361"/>
+            <w:vAlign w:val="center"/>
+            <w:shd w:val="clear" w:color="auto" w:fill="F7F7F7"/>
+            <w:tcBorders>
+              <w:top w:val="single" w:sz="4" w:space="0" w:color="D0D0D0"/>
+              <w:left w:val="single" w:sz="4" w:space="0" w:color="D0D0D0"/>
+              <w:bottom w:val="single" w:sz="4" w:space="0" w:color="D0D0D0"/>
+              <w:right w:val="single" w:sz="4" w:space="0" w:color="D0D0D0"/>
+            </w:tcBorders>
+            <w:tcMar>
+              <w:top w:w="90" w:type="dxa"/>
+              <w:start w:w="120" w:type="dxa"/>
+              <w:bottom w:w="90" w:type="dxa"/>
+              <w:end w:w="120" w:type="dxa"/>
+            </w:tcMar>
           </w:tcPr>
           <w:p>
             <w:pPr>
@@ -2092,14 +2746,29 @@
               <w:rPr>
                 <w:sz w:val="18"/>
               </w:rPr>
-              <w:t>–</w:t>
+              <w:t>✓ Excellent</w:t>
             </w:r>
           </w:p>
         </w:tc>
+      </w:tr>
+      <w:tr>
         <w:tc>
           <w:tcPr>
-            <w:tcW w:type="dxa" w:w="964"/>
-            <w:shd w:val="clear" w:color="auto" w:fill="F2F8F7"/>
+            <w:tcW w:type="dxa" w:w="2041"/>
+            <w:vAlign w:val="center"/>
+            <w:shd w:val="clear" w:color="auto" w:fill="FFFFFF"/>
+            <w:tcBorders>
+              <w:top w:val="single" w:sz="4" w:space="0" w:color="D0D0D0"/>
+              <w:left w:val="single" w:sz="4" w:space="0" w:color="D0D0D0"/>
+              <w:bottom w:val="single" w:sz="4" w:space="0" w:color="D0D0D0"/>
+              <w:right w:val="single" w:sz="4" w:space="0" w:color="D0D0D0"/>
+            </w:tcBorders>
+            <w:tcMar>
+              <w:top w:w="90" w:type="dxa"/>
+              <w:start w:w="120" w:type="dxa"/>
+              <w:bottom w:w="90" w:type="dxa"/>
+              <w:end w:w="120" w:type="dxa"/>
+            </w:tcMar>
           </w:tcPr>
           <w:p>
             <w:pPr>
@@ -2109,67 +2778,27 @@
               <w:rPr>
                 <w:sz w:val="18"/>
               </w:rPr>
-              <w:t>–</w:t>
+              <w:t>Cell Fouling (%)</w:t>
             </w:r>
           </w:p>
         </w:tc>
         <w:tc>
           <w:tcPr>
-            <w:tcW w:type="dxa" w:w="1020"/>
-            <w:shd w:val="clear" w:color="auto" w:fill="F2F8F7"/>
-          </w:tcPr>
-          <w:p>
-            <w:pPr>
-              <w:spacing w:before="60" w:after="60"/>
-            </w:pPr>
-            <w:r>
-              <w:rPr>
-                <w:sz w:val="18"/>
-              </w:rPr>
-              <w:t>–</w:t>
-            </w:r>
-          </w:p>
-        </w:tc>
-        <w:tc>
-          <w:tcPr>
-            <w:tcW w:type="dxa" w:w="1247"/>
-            <w:shd w:val="clear" w:color="auto" w:fill="F2F8F7"/>
-          </w:tcPr>
-          <w:p>
-            <w:pPr>
-              <w:spacing w:before="60" w:after="60"/>
-            </w:pPr>
-            <w:r>
-              <w:rPr>
-                <w:sz w:val="18"/>
-              </w:rPr>
-              <w:t>See chart</w:t>
-            </w:r>
-          </w:p>
-        </w:tc>
-      </w:tr>
-      <w:tr>
-        <w:tc>
-          <w:tcPr>
-            <w:tcW w:type="dxa" w:w="1814"/>
+            <w:tcW w:type="dxa" w:w="1417"/>
+            <w:vAlign w:val="center"/>
             <w:shd w:val="clear" w:color="auto" w:fill="FFFFFF"/>
-          </w:tcPr>
-          <w:p>
-            <w:pPr>
-              <w:spacing w:before="60" w:after="60"/>
-            </w:pPr>
-            <w:r>
-              <w:rPr>
-                <w:sz w:val="18"/>
-              </w:rPr>
-              <w:t>Turbidity (NTU)</w:t>
-            </w:r>
-          </w:p>
-        </w:tc>
-        <w:tc>
-          <w:tcPr>
-            <w:tcW w:type="dxa" w:w="1247"/>
-            <w:shd w:val="clear" w:color="auto" w:fill="FFFFFF"/>
+            <w:tcBorders>
+              <w:top w:val="single" w:sz="4" w:space="0" w:color="D0D0D0"/>
+              <w:left w:val="single" w:sz="4" w:space="0" w:color="D0D0D0"/>
+              <w:bottom w:val="single" w:sz="4" w:space="0" w:color="D0D0D0"/>
+              <w:right w:val="single" w:sz="4" w:space="0" w:color="D0D0D0"/>
+            </w:tcBorders>
+            <w:tcMar>
+              <w:top w:w="90" w:type="dxa"/>
+              <w:start w:w="120" w:type="dxa"/>
+              <w:bottom w:w="90" w:type="dxa"/>
+              <w:end w:w="120" w:type="dxa"/>
+            </w:tcMar>
           </w:tcPr>
           <w:p>
             <w:pPr>
@@ -2185,180 +2814,21 @@
         </w:tc>
         <w:tc>
           <w:tcPr>
-            <w:tcW w:type="dxa" w:w="850"/>
+            <w:tcW w:type="dxa" w:w="1020"/>
+            <w:vAlign w:val="center"/>
             <w:shd w:val="clear" w:color="auto" w:fill="FFFFFF"/>
-          </w:tcPr>
-          <w:p>
-            <w:pPr>
-              <w:spacing w:before="60" w:after="60"/>
-            </w:pPr>
-            <w:r>
-              <w:rPr>
-                <w:sz w:val="18"/>
-              </w:rPr>
-              <w:t>14.865</w:t>
-            </w:r>
-          </w:p>
-        </w:tc>
-        <w:tc>
-          <w:tcPr>
-            <w:tcW w:type="dxa" w:w="850"/>
-            <w:shd w:val="clear" w:color="auto" w:fill="FFFFFF"/>
-          </w:tcPr>
-          <w:p>
-            <w:pPr>
-              <w:spacing w:before="60" w:after="60"/>
-            </w:pPr>
-            <w:r>
-              <w:rPr>
-                <w:sz w:val="18"/>
-              </w:rPr>
-              <w:t>15.800</w:t>
-            </w:r>
-          </w:p>
-        </w:tc>
-        <w:tc>
-          <w:tcPr>
-            <w:tcW w:type="dxa" w:w="794"/>
-            <w:shd w:val="clear" w:color="auto" w:fill="FFFFFF"/>
-          </w:tcPr>
-          <w:p>
-            <w:pPr>
-              <w:spacing w:before="60" w:after="60"/>
-            </w:pPr>
-            <w:r>
-              <w:rPr>
-                <w:sz w:val="18"/>
-              </w:rPr>
-              <w:t>0.000</w:t>
-            </w:r>
-          </w:p>
-        </w:tc>
-        <w:tc>
-          <w:tcPr>
-            <w:tcW w:type="dxa" w:w="794"/>
-            <w:shd w:val="clear" w:color="auto" w:fill="FFFFFF"/>
-          </w:tcPr>
-          <w:p>
-            <w:pPr>
-              <w:spacing w:before="60" w:after="60"/>
-            </w:pPr>
-            <w:r>
-              <w:rPr>
-                <w:sz w:val="18"/>
-              </w:rPr>
-              <w:t>49.475</w:t>
-            </w:r>
-          </w:p>
-        </w:tc>
-        <w:tc>
-          <w:tcPr>
-            <w:tcW w:type="dxa" w:w="964"/>
-            <w:shd w:val="clear" w:color="auto" w:fill="FFFFFF"/>
-          </w:tcPr>
-          <w:p>
-            <w:pPr>
-              <w:spacing w:before="60" w:after="60"/>
-            </w:pPr>
-            <w:r>
-              <w:rPr>
-                <w:sz w:val="18"/>
-              </w:rPr>
-              <w:t>–</w:t>
-            </w:r>
-          </w:p>
-        </w:tc>
-        <w:tc>
-          <w:tcPr>
-            <w:tcW w:type="dxa" w:w="964"/>
-            <w:shd w:val="clear" w:color="auto" w:fill="FFFFFF"/>
-          </w:tcPr>
-          <w:p>
-            <w:pPr>
-              <w:spacing w:before="60" w:after="60"/>
-            </w:pPr>
-            <w:r>
-              <w:rPr>
-                <w:sz w:val="18"/>
-              </w:rPr>
-              <w:t>75.0</w:t>
-            </w:r>
-          </w:p>
-        </w:tc>
-        <w:tc>
-          <w:tcPr>
-            <w:tcW w:type="dxa" w:w="1020"/>
-            <w:shd w:val="clear" w:color="auto" w:fill="FFFFFF"/>
-          </w:tcPr>
-          <w:p>
-            <w:pPr>
-              <w:spacing w:before="60" w:after="60"/>
-            </w:pPr>
-            <w:r>
-              <w:rPr>
-                <w:sz w:val="18"/>
-              </w:rPr>
-              <w:t>–</w:t>
-            </w:r>
-          </w:p>
-        </w:tc>
-        <w:tc>
-          <w:tcPr>
-            <w:tcW w:type="dxa" w:w="1247"/>
-            <w:shd w:val="clear" w:color="auto" w:fill="FFFFFF"/>
-          </w:tcPr>
-          <w:p>
-            <w:pPr>
-              <w:spacing w:before="60" w:after="60"/>
-            </w:pPr>
-            <w:r>
-              <w:rPr>
-                <w:sz w:val="18"/>
-              </w:rPr>
-              <w:t>ℹ Info</w:t>
-            </w:r>
-          </w:p>
-        </w:tc>
-      </w:tr>
-      <w:tr>
-        <w:tc>
-          <w:tcPr>
-            <w:tcW w:type="dxa" w:w="1814"/>
-            <w:shd w:val="clear" w:color="auto" w:fill="F2F8F7"/>
-          </w:tcPr>
-          <w:p>
-            <w:pPr>
-              <w:spacing w:before="60" w:after="60"/>
-            </w:pPr>
-            <w:r>
-              <w:rPr>
-                <w:sz w:val="18"/>
-              </w:rPr>
-              <w:t>Cell Fouling (%)</w:t>
-            </w:r>
-          </w:p>
-        </w:tc>
-        <w:tc>
-          <w:tcPr>
-            <w:tcW w:type="dxa" w:w="1247"/>
-            <w:shd w:val="clear" w:color="auto" w:fill="F2F8F7"/>
-          </w:tcPr>
-          <w:p>
-            <w:pPr>
-              <w:spacing w:before="60" w:after="60"/>
-            </w:pPr>
-            <w:r>
-              <w:rPr>
-                <w:sz w:val="18"/>
-              </w:rPr>
-              <w:t>ACM Skid</w:t>
-            </w:r>
-          </w:p>
-        </w:tc>
-        <w:tc>
-          <w:tcPr>
-            <w:tcW w:type="dxa" w:w="850"/>
-            <w:shd w:val="clear" w:color="auto" w:fill="F2F8F7"/>
+            <w:tcBorders>
+              <w:top w:val="single" w:sz="4" w:space="0" w:color="D0D0D0"/>
+              <w:left w:val="single" w:sz="4" w:space="0" w:color="D0D0D0"/>
+              <w:bottom w:val="single" w:sz="4" w:space="0" w:color="D0D0D0"/>
+              <w:right w:val="single" w:sz="4" w:space="0" w:color="D0D0D0"/>
+            </w:tcBorders>
+            <w:tcMar>
+              <w:top w:w="90" w:type="dxa"/>
+              <w:start w:w="120" w:type="dxa"/>
+              <w:bottom w:w="90" w:type="dxa"/>
+              <w:end w:w="120" w:type="dxa"/>
+            </w:tcMar>
           </w:tcPr>
           <w:p>
             <w:pPr>
@@ -2374,8 +2844,21 @@
         </w:tc>
         <w:tc>
           <w:tcPr>
-            <w:tcW w:type="dxa" w:w="850"/>
-            <w:shd w:val="clear" w:color="auto" w:fill="F2F8F7"/>
+            <w:tcW w:type="dxa" w:w="1077"/>
+            <w:vAlign w:val="center"/>
+            <w:shd w:val="clear" w:color="auto" w:fill="FFFFFF"/>
+            <w:tcBorders>
+              <w:top w:val="single" w:sz="4" w:space="0" w:color="D0D0D0"/>
+              <w:left w:val="single" w:sz="4" w:space="0" w:color="D0D0D0"/>
+              <w:bottom w:val="single" w:sz="4" w:space="0" w:color="D0D0D0"/>
+              <w:right w:val="single" w:sz="4" w:space="0" w:color="D0D0D0"/>
+            </w:tcBorders>
+            <w:tcMar>
+              <w:top w:w="90" w:type="dxa"/>
+              <w:start w:w="120" w:type="dxa"/>
+              <w:bottom w:w="90" w:type="dxa"/>
+              <w:end w:w="120" w:type="dxa"/>
+            </w:tcMar>
           </w:tcPr>
           <w:p>
             <w:pPr>
@@ -2385,65 +2868,27 @@
               <w:rPr>
                 <w:sz w:val="18"/>
               </w:rPr>
-              <w:t>6.921</w:t>
+              <w:t>0.0</w:t>
             </w:r>
           </w:p>
         </w:tc>
         <w:tc>
           <w:tcPr>
-            <w:tcW w:type="dxa" w:w="794"/>
-            <w:shd w:val="clear" w:color="auto" w:fill="F2F8F7"/>
-          </w:tcPr>
-          <w:p>
-            <w:pPr>
-              <w:spacing w:before="60" w:after="60"/>
-            </w:pPr>
-            <w:r>
-              <w:rPr>
-                <w:sz w:val="18"/>
-              </w:rPr>
-              <w:t>0.000</w:t>
-            </w:r>
-          </w:p>
-        </w:tc>
-        <w:tc>
-          <w:tcPr>
-            <w:tcW w:type="dxa" w:w="794"/>
-            <w:shd w:val="clear" w:color="auto" w:fill="F2F8F7"/>
-          </w:tcPr>
-          <w:p>
-            <w:pPr>
-              <w:spacing w:before="60" w:after="60"/>
-            </w:pPr>
-            <w:r>
-              <w:rPr>
-                <w:sz w:val="18"/>
-              </w:rPr>
-              <w:t>15.558</w:t>
-            </w:r>
-          </w:p>
-        </w:tc>
-        <w:tc>
-          <w:tcPr>
-            <w:tcW w:type="dxa" w:w="964"/>
-            <w:shd w:val="clear" w:color="auto" w:fill="F2F8F7"/>
-          </w:tcPr>
-          <w:p>
-            <w:pPr>
-              <w:spacing w:before="60" w:after="60"/>
-            </w:pPr>
-            <w:r>
-              <w:rPr>
-                <w:sz w:val="18"/>
-              </w:rPr>
-              <w:t>–</w:t>
-            </w:r>
-          </w:p>
-        </w:tc>
-        <w:tc>
-          <w:tcPr>
-            <w:tcW w:type="dxa" w:w="964"/>
-            <w:shd w:val="clear" w:color="auto" w:fill="F2F8F7"/>
+            <w:tcW w:type="dxa" w:w="1077"/>
+            <w:vAlign w:val="center"/>
+            <w:shd w:val="clear" w:color="auto" w:fill="FFFFFF"/>
+            <w:tcBorders>
+              <w:top w:val="single" w:sz="4" w:space="0" w:color="D0D0D0"/>
+              <w:left w:val="single" w:sz="4" w:space="0" w:color="D0D0D0"/>
+              <w:bottom w:val="single" w:sz="4" w:space="0" w:color="D0D0D0"/>
+              <w:right w:val="single" w:sz="4" w:space="0" w:color="D0D0D0"/>
+            </w:tcBorders>
+            <w:tcMar>
+              <w:top w:w="90" w:type="dxa"/>
+              <w:start w:w="120" w:type="dxa"/>
+              <w:bottom w:w="90" w:type="dxa"/>
+              <w:end w:w="120" w:type="dxa"/>
+            </w:tcMar>
           </w:tcPr>
           <w:p>
             <w:pPr>
@@ -2459,8 +2904,21 @@
         </w:tc>
         <w:tc>
           <w:tcPr>
-            <w:tcW w:type="dxa" w:w="1020"/>
-            <w:shd w:val="clear" w:color="auto" w:fill="F2F8F7"/>
+            <w:tcW w:type="dxa" w:w="1134"/>
+            <w:vAlign w:val="center"/>
+            <w:shd w:val="clear" w:color="auto" w:fill="FFFFFF"/>
+            <w:tcBorders>
+              <w:top w:val="single" w:sz="4" w:space="0" w:color="D0D0D0"/>
+              <w:left w:val="single" w:sz="4" w:space="0" w:color="D0D0D0"/>
+              <w:bottom w:val="single" w:sz="4" w:space="0" w:color="D0D0D0"/>
+              <w:right w:val="single" w:sz="4" w:space="0" w:color="D0D0D0"/>
+            </w:tcBorders>
+            <w:tcMar>
+              <w:top w:w="90" w:type="dxa"/>
+              <w:start w:w="120" w:type="dxa"/>
+              <w:bottom w:w="90" w:type="dxa"/>
+              <w:end w:w="120" w:type="dxa"/>
+            </w:tcMar>
           </w:tcPr>
           <w:p>
             <w:pPr>
@@ -2470,14 +2928,27 @@
               <w:rPr>
                 <w:sz w:val="18"/>
               </w:rPr>
-              <w:t>–</w:t>
+              <w:t>100.0%</w:t>
             </w:r>
           </w:p>
         </w:tc>
         <w:tc>
           <w:tcPr>
-            <w:tcW w:type="dxa" w:w="1247"/>
-            <w:shd w:val="clear" w:color="auto" w:fill="F2F8F7"/>
+            <w:tcW w:type="dxa" w:w="1361"/>
+            <w:vAlign w:val="center"/>
+            <w:shd w:val="clear" w:color="auto" w:fill="FFFFFF"/>
+            <w:tcBorders>
+              <w:top w:val="single" w:sz="4" w:space="0" w:color="D0D0D0"/>
+              <w:left w:val="single" w:sz="4" w:space="0" w:color="D0D0D0"/>
+              <w:bottom w:val="single" w:sz="4" w:space="0" w:color="D0D0D0"/>
+              <w:right w:val="single" w:sz="4" w:space="0" w:color="D0D0D0"/>
+            </w:tcBorders>
+            <w:tcMar>
+              <w:top w:w="90" w:type="dxa"/>
+              <w:start w:w="120" w:type="dxa"/>
+              <w:bottom w:w="90" w:type="dxa"/>
+              <w:end w:w="120" w:type="dxa"/>
+            </w:tcMar>
           </w:tcPr>
           <w:p>
             <w:pPr>
@@ -2487,179 +2958,7 @@
               <w:rPr>
                 <w:sz w:val="18"/>
               </w:rPr>
-              <w:t>ℹ Info</w:t>
-            </w:r>
-          </w:p>
-        </w:tc>
-      </w:tr>
-      <w:tr>
-        <w:tc>
-          <w:tcPr>
-            <w:tcW w:type="dxa" w:w="1814"/>
-            <w:shd w:val="clear" w:color="auto" w:fill="FFFFFF"/>
-          </w:tcPr>
-          <w:p>
-            <w:pPr>
-              <w:spacing w:before="60" w:after="60"/>
-            </w:pPr>
-            <w:r>
-              <w:rPr>
-                <w:sz w:val="18"/>
-              </w:rPr>
-              <w:t>FRC</w:t>
-            </w:r>
-          </w:p>
-        </w:tc>
-        <w:tc>
-          <w:tcPr>
-            <w:tcW w:type="dxa" w:w="1247"/>
-            <w:shd w:val="clear" w:color="auto" w:fill="FFFFFF"/>
-          </w:tcPr>
-          <w:p>
-            <w:pPr>
-              <w:spacing w:before="60" w:after="60"/>
-            </w:pPr>
-            <w:r>
-              <w:rPr>
-                <w:sz w:val="18"/>
-              </w:rPr>
-              <w:t>Field Data</w:t>
-            </w:r>
-          </w:p>
-        </w:tc>
-        <w:tc>
-          <w:tcPr>
-            <w:tcW w:type="dxa" w:w="850"/>
-            <w:shd w:val="clear" w:color="auto" w:fill="FFFFFF"/>
-          </w:tcPr>
-          <w:p>
-            <w:pPr>
-              <w:spacing w:before="60" w:after="60"/>
-            </w:pPr>
-            <w:r>
-              <w:rPr>
-                <w:sz w:val="18"/>
-              </w:rPr>
-              <w:t>Not avail.</w:t>
-            </w:r>
-          </w:p>
-        </w:tc>
-        <w:tc>
-          <w:tcPr>
-            <w:tcW w:type="dxa" w:w="850"/>
-            <w:shd w:val="clear" w:color="auto" w:fill="FFFFFF"/>
-          </w:tcPr>
-          <w:p>
-            <w:pPr>
-              <w:spacing w:before="60" w:after="60"/>
-            </w:pPr>
-            <w:r>
-              <w:rPr>
-                <w:sz w:val="18"/>
-              </w:rPr>
-              <w:t>–</w:t>
-            </w:r>
-          </w:p>
-        </w:tc>
-        <w:tc>
-          <w:tcPr>
-            <w:tcW w:type="dxa" w:w="794"/>
-            <w:shd w:val="clear" w:color="auto" w:fill="FFFFFF"/>
-          </w:tcPr>
-          <w:p>
-            <w:pPr>
-              <w:spacing w:before="60" w:after="60"/>
-            </w:pPr>
-            <w:r>
-              <w:rPr>
-                <w:sz w:val="18"/>
-              </w:rPr>
-              <w:t>–</w:t>
-            </w:r>
-          </w:p>
-        </w:tc>
-        <w:tc>
-          <w:tcPr>
-            <w:tcW w:type="dxa" w:w="794"/>
-            <w:shd w:val="clear" w:color="auto" w:fill="FFFFFF"/>
-          </w:tcPr>
-          <w:p>
-            <w:pPr>
-              <w:spacing w:before="60" w:after="60"/>
-            </w:pPr>
-            <w:r>
-              <w:rPr>
-                <w:sz w:val="18"/>
-              </w:rPr>
-              <w:t>–</w:t>
-            </w:r>
-          </w:p>
-        </w:tc>
-        <w:tc>
-          <w:tcPr>
-            <w:tcW w:type="dxa" w:w="964"/>
-            <w:shd w:val="clear" w:color="auto" w:fill="FFFFFF"/>
-          </w:tcPr>
-          <w:p>
-            <w:pPr>
-              <w:spacing w:before="60" w:after="60"/>
-            </w:pPr>
-            <w:r>
-              <w:rPr>
-                <w:sz w:val="18"/>
-              </w:rPr>
-              <w:t>–</w:t>
-            </w:r>
-          </w:p>
-        </w:tc>
-        <w:tc>
-          <w:tcPr>
-            <w:tcW w:type="dxa" w:w="964"/>
-            <w:shd w:val="clear" w:color="auto" w:fill="FFFFFF"/>
-          </w:tcPr>
-          <w:p>
-            <w:pPr>
-              <w:spacing w:before="60" w:after="60"/>
-            </w:pPr>
-            <w:r>
-              <w:rPr>
-                <w:sz w:val="18"/>
-              </w:rPr>
-              <w:t>–</w:t>
-            </w:r>
-          </w:p>
-        </w:tc>
-        <w:tc>
-          <w:tcPr>
-            <w:tcW w:type="dxa" w:w="1020"/>
-            <w:shd w:val="clear" w:color="auto" w:fill="FFFFFF"/>
-          </w:tcPr>
-          <w:p>
-            <w:pPr>
-              <w:spacing w:before="60" w:after="60"/>
-            </w:pPr>
-            <w:r>
-              <w:rPr>
-                <w:sz w:val="18"/>
-              </w:rPr>
-              <w:t>–</w:t>
-            </w:r>
-          </w:p>
-        </w:tc>
-        <w:tc>
-          <w:tcPr>
-            <w:tcW w:type="dxa" w:w="1247"/>
-            <w:shd w:val="clear" w:color="auto" w:fill="FFFFFF"/>
-          </w:tcPr>
-          <w:p>
-            <w:pPr>
-              <w:spacing w:before="60" w:after="60"/>
-            </w:pPr>
-            <w:r>
-              <w:rPr>
-                <w:sz w:val="18"/>
-              </w:rPr>
-              <w:t>⚠ Check</w:t>
+              <w:t>✓ Excellent</w:t>
             </w:r>
           </w:p>
         </w:tc>
@@ -2673,28 +2972,26 @@
     </w:p>
     <w:p>
       <w:pPr>
-        <w:pBdr>
-          <w:bottom w:val="single" w:sz="8" w:space="4" w:color="00857C"/>
-        </w:pBdr>
-        <w:spacing w:before="280" w:after="80"/>
+        <w:spacing w:before="280" w:after="140"/>
+        <w:shd w:val="clear" w:color="auto" w:fill="009878"/>
       </w:pPr>
       <w:r>
         <w:rPr>
           <w:b/>
-          <w:color w:val="00857C"/>
-          <w:sz w:val="32"/>
+          <w:color w:val="FFFFFF"/>
+          <w:sz w:val="24"/>
         </w:rPr>
-        <w:t>Charts and Comments</w:t>
+        <w:t xml:space="preserve">  Charts and Comments</w:t>
       </w:r>
     </w:p>
     <w:p>
       <w:pPr>
-        <w:spacing w:before="200" w:after="60"/>
+        <w:spacing w:before="200" w:after="80"/>
       </w:pPr>
       <w:r>
         <w:rPr>
           <w:b/>
-          <w:color w:val="005F58"/>
+          <w:color w:val="1D5C7F"/>
           <w:sz w:val="26"/>
         </w:rPr>
         <w:t>Corrosion Rate</w:t>
@@ -2747,7 +3044,7 @@
       <w:r>
         <w:rPr>
           <w:i/>
-          <w:color w:val="444444"/>
+          <w:color w:val="686868"/>
           <w:sz w:val="17"/>
         </w:rPr>
         <w:t>Figure 1: Corrosion Rate — August 2026</w:t>
@@ -2761,7 +3058,7 @@
         <w:rPr>
           <w:b/>
           <w:i/>
-          <w:color w:val="333333"/>
+          <w:color w:val="1D5C7F"/>
           <w:sz w:val="19"/>
         </w:rPr>
         <w:t xml:space="preserve">Comment: </w:t>
@@ -2772,50 +3069,17 @@
           <w:color w:val="333333"/>
           <w:sz w:val="19"/>
         </w:rPr>
-        <w:t>Pattern: corrosion control is increasing, but remains good against the target.</w:t>
-      </w:r>
-      <w:r>
-        <w:br/>
-      </w:r>
-      <w:r>
-        <w:rPr>
-          <w:i/>
-          <w:color w:val="333333"/>
-          <w:sz w:val="19"/>
-        </w:rPr>
-        <w:t>Mild steel corrosion decreased across the month, while copper corrosion increased across the month.</w:t>
-      </w:r>
-      <w:r>
-        <w:br/>
-      </w:r>
-      <w:r>
-        <w:rPr>
-          <w:i/>
-          <w:color w:val="333333"/>
-          <w:sz w:val="19"/>
-        </w:rPr>
-        <w:t>MS was within the 3.0 MPY target, and Cu was within the 0.5 MPY target.</w:t>
-      </w:r>
-      <w:r>
-        <w:br/>
-      </w:r>
-      <w:r>
-        <w:rPr>
-          <w:i/>
-          <w:color w:val="333333"/>
-          <w:sz w:val="19"/>
-        </w:rPr>
-        <w:t>Likely reason: corrosion is still protected, but increasing movement should be checked against product and ORP trends.</w:t>
+        <w:t>During the reporting period, the system remained under good control. The mild steel and copper corrosion rates averaged 0.95 mpy and 0.09 mpy, respectively, both of which are well within the recommended limits of &lt;5 mpy and &lt;0.5 mpy.</w:t>
       </w:r>
     </w:p>
     <w:p>
       <w:pPr>
-        <w:spacing w:before="200" w:after="60"/>
+        <w:spacing w:before="200" w:after="80"/>
       </w:pPr>
       <w:r>
         <w:rPr>
           <w:b/>
-          <w:color w:val="005F58"/>
+          <w:color w:val="1D5C7F"/>
           <w:sz w:val="26"/>
         </w:rPr>
         <w:t>Traced Product Control Trend</w:t>
@@ -2868,7 +3132,7 @@
       <w:r>
         <w:rPr>
           <w:i/>
-          <w:color w:val="444444"/>
+          <w:color w:val="686868"/>
           <w:sz w:val="17"/>
         </w:rPr>
         <w:t>Figure 2: Traced Product — August 2026</w:t>
@@ -2882,7 +3146,7 @@
         <w:rPr>
           <w:b/>
           <w:i/>
-          <w:color w:val="333333"/>
+          <w:color w:val="1D5C7F"/>
           <w:sz w:val="19"/>
         </w:rPr>
         <w:t xml:space="preserve">Comment: </w:t>
@@ -2893,7 +3157,7 @@
           <w:color w:val="333333"/>
           <w:sz w:val="19"/>
         </w:rPr>
-        <w:t>Pattern: Traced Product is still not maintained at the end of the month.</w:t>
+        <w:t>Traced Product was maintained within the setpoint range of 28.0-32.0 ppm only 45.3% of the time.</w:t>
       </w:r>
       <w:r>
         <w:br/>
@@ -2904,7 +3168,7 @@
           <w:color w:val="333333"/>
           <w:sz w:val="19"/>
         </w:rPr>
-        <w:t>The last 7 days still show about 87.1% deviation from setpoint, indicating the issue is still present.</w:t>
+        <w:t>The trend moved from about 52.1 ppm at the start to 54.3 ppm at the end.</w:t>
       </w:r>
       <w:r>
         <w:br/>
@@ -2915,28 +3179,17 @@
           <w:color w:val="333333"/>
           <w:sz w:val="19"/>
         </w:rPr>
-        <w:t>The Traced Product average was above the configured range. The monthly in-range performance was 45.3%.</w:t>
-      </w:r>
-      <w:r>
-        <w:br/>
-      </w:r>
-      <w:r>
-        <w:rPr>
-          <w:i/>
-          <w:color w:val="333333"/>
-          <w:sz w:val="19"/>
-        </w:rPr>
-        <w:t>Likely reason: the Traced Product trend is related to the high conductivity trend; reduced blowdown, higher cycles, or concentration effects are pushing both up.</w:t>
+        <w:t>The Traced Product increase correlates with the increase in conductivity, indicating the product trend is linked to tower concentration; the blowdown and makeup water valves will be inspected so product can be maintained in good control in future.</w:t>
       </w:r>
     </w:p>
     <w:p>
       <w:pPr>
-        <w:spacing w:before="200" w:after="60"/>
+        <w:spacing w:before="200" w:after="80"/>
       </w:pPr>
       <w:r>
         <w:rPr>
           <w:b/>
-          <w:color w:val="005F58"/>
+          <w:color w:val="1D5C7F"/>
           <w:sz w:val="26"/>
         </w:rPr>
         <w:t>ORP vs Copper Corrosion Rate</w:t>
@@ -2989,7 +3242,7 @@
       <w:r>
         <w:rPr>
           <w:i/>
-          <w:color w:val="444444"/>
+          <w:color w:val="686868"/>
           <w:sz w:val="17"/>
         </w:rPr>
         <w:t>Figure 3: ORP vs Copper Corrosion Rate — August 2026</w:t>
@@ -3003,7 +3256,7 @@
         <w:rPr>
           <w:b/>
           <w:i/>
-          <w:color w:val="333333"/>
+          <w:color w:val="1D5C7F"/>
           <w:sz w:val="19"/>
         </w:rPr>
         <w:t xml:space="preserve">Comment: </w:t>
@@ -3014,7 +3267,7 @@
           <w:color w:val="333333"/>
           <w:sz w:val="19"/>
         </w:rPr>
-        <w:t>Pattern: ORP response is decreasing across the month.</w:t>
+        <w:t>ORP did not show more than 50 mV spikes at least three times during the week from 08 August 2026 to 14 August 2026; no slug dosage of biocide is observed during this period. This could be due to lack of inventory, dosing pump lost prime, or a leak in the pump discharge line.</w:t>
       </w:r>
       <w:r>
         <w:br/>
@@ -3025,160 +3278,17 @@
           <w:color w:val="333333"/>
           <w:sz w:val="19"/>
         </w:rPr>
-        <w:t>ORP showed a visible spike response pattern during the month without relying on absolute ORP values.</w:t>
-      </w:r>
-      <w:r>
-        <w:br/>
-      </w:r>
-      <w:r>
-        <w:rPr>
-          <w:i/>
-          <w:color w:val="333333"/>
-          <w:sz w:val="19"/>
-        </w:rPr>
-        <w:t>Copper corrosion increased across the month while the ORP pattern changed.</w:t>
-      </w:r>
-      <w:r>
-        <w:br/>
-      </w:r>
-      <w:r>
-        <w:rPr>
-          <w:i/>
-          <w:color w:val="333333"/>
-          <w:sz w:val="19"/>
-        </w:rPr>
-        <w:t>Likely reason: biocide response is present and corrosion inhibitor is preventing a copper upset.</w:t>
+        <w:t>Copper corrosion remained within the recommended limit of 0.5 mpy.</w:t>
       </w:r>
     </w:p>
     <w:p>
       <w:pPr>
-        <w:spacing w:before="200" w:after="60"/>
+        <w:spacing w:before="200" w:after="80"/>
       </w:pPr>
       <w:r>
         <w:rPr>
           <w:b/>
-          <w:color w:val="005F58"/>
-          <w:sz w:val="26"/>
-        </w:rPr>
-        <w:t>Oxidizing Biocide Pump Relay vs Copper Corrosion</w:t>
-      </w:r>
-    </w:p>
-    <w:p>
-      <w:pPr>
-        <w:jc w:val="center"/>
-      </w:pPr>
-      <w:r>
-        <w:drawing>
-          <wp:inline xmlns:a="http://schemas.openxmlformats.org/drawingml/2006/main" xmlns:pic="http://schemas.openxmlformats.org/drawingml/2006/picture">
-            <wp:extent cx="5486400" cy="2582656"/>
-            <wp:docPr id="4" name="Picture 4"/>
-            <wp:cNvGraphicFramePr>
-              <a:graphicFrameLocks noChangeAspect="1"/>
-            </wp:cNvGraphicFramePr>
-            <a:graphic>
-              <a:graphicData uri="http://schemas.openxmlformats.org/drawingml/2006/picture">
-                <pic:pic>
-                  <pic:nvPicPr>
-                    <pic:cNvPr id="0" name="candler_hospital_savannah_ga_us_controllers_84253f5fb67b_84253fab8c75_august_2026_biocide_corrosion.png"/>
-                    <pic:cNvPicPr/>
-                  </pic:nvPicPr>
-                  <pic:blipFill>
-                    <a:blip r:embed="rId14"/>
-                    <a:stretch>
-                      <a:fillRect/>
-                    </a:stretch>
-                  </pic:blipFill>
-                  <pic:spPr>
-                    <a:xfrm>
-                      <a:off x="0" y="0"/>
-                      <a:ext cx="5486400" cy="2582656"/>
-                    </a:xfrm>
-                    <a:prstGeom prst="rect"/>
-                  </pic:spPr>
-                </pic:pic>
-              </a:graphicData>
-            </a:graphic>
-          </wp:inline>
-        </w:drawing>
-      </w:r>
-    </w:p>
-    <w:p>
-      <w:pPr>
-        <w:spacing w:after="120"/>
-        <w:jc w:val="center"/>
-      </w:pPr>
-      <w:r>
-        <w:rPr>
-          <w:i/>
-          <w:color w:val="444444"/>
-          <w:sz w:val="17"/>
-        </w:rPr>
-        <w:t>Figure 4: Oxidizing Biocide Pump Relay vs Copper Corrosion — August 2026</w:t>
-      </w:r>
-    </w:p>
-    <w:p>
-      <w:pPr>
-        <w:spacing w:before="40" w:after="200"/>
-      </w:pPr>
-      <w:r>
-        <w:rPr>
-          <w:b/>
-          <w:i/>
-          <w:color w:val="333333"/>
-          <w:sz w:val="19"/>
-        </w:rPr>
-        <w:t xml:space="preserve">Comment: </w:t>
-      </w:r>
-      <w:r>
-        <w:rPr>
-          <w:i/>
-          <w:color w:val="333333"/>
-          <w:sz w:val="19"/>
-        </w:rPr>
-        <w:t>Pattern: biocide feed versus copper corrosion is increasing, but remains good against the target.</w:t>
-      </w:r>
-      <w:r>
-        <w:br/>
-      </w:r>
-      <w:r>
-        <w:rPr>
-          <w:i/>
-          <w:color w:val="333333"/>
-          <w:sz w:val="19"/>
-        </w:rPr>
-        <w:t>Biocide relay activity was present in the monthly trend.</w:t>
-      </w:r>
-      <w:r>
-        <w:br/>
-      </w:r>
-      <w:r>
-        <w:rPr>
-          <w:i/>
-          <w:color w:val="333333"/>
-          <w:sz w:val="19"/>
-        </w:rPr>
-        <w:t>Relay activity decreased across the month when the month is split into early and late periods.</w:t>
-      </w:r>
-      <w:r>
-        <w:br/>
-      </w:r>
-      <w:r>
-        <w:rPr>
-          <w:i/>
-          <w:color w:val="333333"/>
-          <w:sz w:val="19"/>
-        </w:rPr>
-        <w:t>Likely reason: relay feed timing is adequate and copper corrosion remains protected.</w:t>
-      </w:r>
-    </w:p>
-    <w:p>
-      <w:pPr>
-        <w:spacing w:before="200" w:after="60"/>
-      </w:pPr>
-      <w:r>
-        <w:rPr>
-          <w:b/>
-          <w:color w:val="005F58"/>
+          <w:color w:val="1D5C7F"/>
           <w:sz w:val="26"/>
         </w:rPr>
         <w:t>Electrode Conductivity</w:t>
@@ -3192,7 +3302,7 @@
         <w:drawing>
           <wp:inline xmlns:a="http://schemas.openxmlformats.org/drawingml/2006/main" xmlns:pic="http://schemas.openxmlformats.org/drawingml/2006/picture">
             <wp:extent cx="5486400" cy="2578283"/>
-            <wp:docPr id="5" name="Picture 5"/>
+            <wp:docPr id="4" name="Picture 4"/>
             <wp:cNvGraphicFramePr>
               <a:graphicFrameLocks noChangeAspect="1"/>
             </wp:cNvGraphicFramePr>
@@ -3204,7 +3314,7 @@
                     <pic:cNvPicPr/>
                   </pic:nvPicPr>
                   <pic:blipFill>
-                    <a:blip r:embed="rId15"/>
+                    <a:blip r:embed="rId14"/>
                     <a:stretch>
                       <a:fillRect/>
                     </a:stretch>
@@ -3231,10 +3341,10 @@
       <w:r>
         <w:rPr>
           <w:i/>
-          <w:color w:val="444444"/>
+          <w:color w:val="686868"/>
           <w:sz w:val="17"/>
         </w:rPr>
-        <w:t>Figure 5: Electrode Conductivity — August 2026</w:t>
+        <w:t>Figure 4: Electrode Conductivity — August 2026</w:t>
       </w:r>
     </w:p>
     <w:p>
@@ -3245,7 +3355,7 @@
         <w:rPr>
           <w:b/>
           <w:i/>
-          <w:color w:val="333333"/>
+          <w:color w:val="1D5C7F"/>
           <w:sz w:val="19"/>
         </w:rPr>
         <w:t xml:space="preserve">Comment: </w:t>
@@ -3256,40 +3366,7 @@
           <w:color w:val="333333"/>
           <w:sz w:val="19"/>
         </w:rPr>
-        <w:t>Pattern: conductivity is increasing and needs attention against the target.</w:t>
-      </w:r>
-      <w:r>
-        <w:br/>
-      </w:r>
-      <w:r>
-        <w:rPr>
-          <w:i/>
-          <w:color w:val="333333"/>
-          <w:sz w:val="19"/>
-        </w:rPr>
-        <w:t>The trend moved from about 633.9 µS/cm at the start to 703.6 µS/cm at the end.</w:t>
-      </w:r>
-      <w:r>
-        <w:br/>
-      </w:r>
-      <w:r>
-        <w:rPr>
-          <w:i/>
-          <w:color w:val="333333"/>
-          <w:sz w:val="19"/>
-        </w:rPr>
-        <w:t>The conductivity average was above the configured range. The monthly in-range performance was 5.4%.</w:t>
-      </w:r>
-      <w:r>
-        <w:br/>
-      </w:r>
-      <w:r>
-        <w:rPr>
-          <w:i/>
-          <w:color w:val="333333"/>
-          <w:sz w:val="19"/>
-        </w:rPr>
-        <w:t>Likely reason: reduced blowdown, higher cycles, evaporation concentration, or concentrated makeup is raising conductivity.</w:t>
+        <w:t>The average conductivity is 668.8 µS/cm, which is above the recommended setpoint range of 570-630 µS/cm. Conductivity increased from about 633.9 µS/cm at the start of the month to 703.6 µS/cm at the end. Recommendation: reduced blowdown, higher cycles, evaporation concentration, or concentrated makeup is raising conductivity.</w:t>
       </w:r>
     </w:p>
     <w:p>
@@ -3299,18 +3376,16 @@
     </w:p>
     <w:p>
       <w:pPr>
-        <w:pBdr>
-          <w:bottom w:val="single" w:sz="8" w:space="4" w:color="00857C"/>
-        </w:pBdr>
-        <w:spacing w:before="280" w:after="80"/>
+        <w:spacing w:before="280" w:after="140"/>
+        <w:shd w:val="clear" w:color="auto" w:fill="009878"/>
       </w:pPr>
       <w:r>
         <w:rPr>
           <w:b/>
-          <w:color w:val="00857C"/>
-          <w:sz w:val="32"/>
+          <w:color w:val="FFFFFF"/>
+          <w:sz w:val="24"/>
         </w:rPr>
-        <w:t>Closing Summary</w:t>
+        <w:t xml:space="preserve">  Closing Summary</w:t>
       </w:r>
     </w:p>
     <w:p>
@@ -3347,7 +3422,7 @@
     </w:pPr>
     <w:r>
       <w:rPr>
-        <w:color w:val="444444"/>
+        <w:color w:val="686868"/>
         <w:sz w:val="16"/>
       </w:rPr>
       <w:t>Buckman Digital Water  |  Confidential</w:t>
@@ -3367,7 +3442,7 @@
     </w:pPr>
     <w:r>
       <w:rPr>
-        <w:color w:val="444444"/>
+        <w:color w:val="686868"/>
         <w:sz w:val="16"/>
       </w:rPr>
       <w:t>Buckman  |  Candler Hospital Savannah GA (US)  |  August 2026 Cooling Water Performance Report</w:t>
@@ -3739,6 +3814,10 @@
     <w:name w:val="Normal"/>
     <w:qFormat/>
     <w:rsid w:val="00FC693F"/>
+    <w:rPr>
+      <w:rFonts w:ascii="Arial" w:hAnsi="Arial" w:eastAsia="Arial"/>
+      <w:sz w:val="20"/>
+    </w:rPr>
   </w:style>
   <w:style w:type="paragraph" w:styleId="Header">
     <w:name w:val="header"/>

</xml_diff>